<commit_message>
Wrote the 2-3 tree section
</commit_message>
<xml_diff>
--- a/group_19_COMP0005_report.docx
+++ b/group_19_COMP0005_report.docx
@@ -365,7 +365,144 @@
           <w:rFonts w:ascii="Arial" w:hAnsi="Arial" w:cs="Arial"/>
           <w:color w:val="000000" w:themeColor="text1"/>
         </w:rPr>
-        <w:t>[First Chosen Data Structure]</w:t>
+        <w:t>2-3 Tree</w:t>
+      </w:r>
+    </w:p>
+    <w:p>
+      <w:r>
+        <w:t xml:space="preserve">The 2-3 Tree is a self-balancing tree in which each node has either one or two keys, with two or three child nodes respectively. All leaves sit at the same depth, which, theoretically, guarantees an </w:t>
+      </w:r>
+      <w:proofErr w:type="gramStart"/>
+      <w:r>
+        <w:t>O(</w:t>
+      </w:r>
+      <w:proofErr w:type="gramEnd"/>
+      <w:r>
+        <w:t>log n) wors</w:t>
+      </w:r>
+      <w:r>
+        <w:t>t</w:t>
+      </w:r>
+      <w:r>
+        <w:t xml:space="preserve"> case complexity for </w:t>
+      </w:r>
+      <w:r>
+        <w:t xml:space="preserve">per node </w:t>
+      </w:r>
+      <w:r>
+        <w:t>search and insertion. The tree self-balances in insertion as all overflow is propagated upward through the middle key.</w:t>
+      </w:r>
+    </w:p>
+    <w:p/>
+    <w:p>
+      <w:pPr>
+        <w:rPr>
+          <w:b/>
+          <w:bCs/>
+        </w:rPr>
+      </w:pPr>
+      <w:r>
+        <w:rPr>
+          <w:b/>
+          <w:bCs/>
+        </w:rPr>
+        <w:t>Insertion</w:t>
+      </w:r>
+    </w:p>
+    <w:p>
+      <w:r>
+        <w:t xml:space="preserve">Across all dataset sizes and distributions, insertion times scaled linearly with </w:t>
+      </w:r>
+      <w:r>
+        <w:t>n and</w:t>
+      </w:r>
+      <w:r>
+        <w:t xml:space="preserve"> were consistent with an </w:t>
+      </w:r>
+      <w:proofErr w:type="gramStart"/>
+      <w:r>
+        <w:t>O(</w:t>
+      </w:r>
+      <w:proofErr w:type="gramEnd"/>
+      <w:r>
+        <w:t xml:space="preserve">n log n) insertion time. </w:t>
+      </w:r>
+      <w:r>
+        <w:t>This is consistent with the theoretical worst-case complexity.</w:t>
+      </w:r>
+    </w:p>
+    <w:p/>
+    <w:p>
+      <w:pPr>
+        <w:rPr>
+          <w:b/>
+          <w:bCs/>
+        </w:rPr>
+      </w:pPr>
+      <w:r>
+        <w:rPr>
+          <w:b/>
+          <w:bCs/>
+        </w:rPr>
+        <w:t>Search</w:t>
+      </w:r>
+    </w:p>
+    <w:p>
+      <w:r>
+        <w:t xml:space="preserve">The 2-3 tree consistently displayed the slowest search times of all three structures, across all conditions. At n = 50,000, the 2-3 tree’s search time on random data was roughly 3.1 microseconds, which compared to the LLRB and AVL tree’s roughly 1 microsecond search times, makes it three times slower. This, again, is very likely due to the specific implementation and per node overhead. Each node requires checking up to two keys, and Python list lookup carries more overhead than the standard scalar comparison used in binary tree structures. </w:t>
+      </w:r>
+    </w:p>
+    <w:p/>
+    <w:p>
+      <w:pPr>
+        <w:rPr>
+          <w:b/>
+          <w:bCs/>
+        </w:rPr>
+      </w:pPr>
+      <w:r>
+        <w:rPr>
+          <w:b/>
+          <w:bCs/>
+        </w:rPr>
+        <w:t>Input Distribution Effects</w:t>
+      </w:r>
+    </w:p>
+    <w:p>
+      <w:r>
+        <w:t xml:space="preserve">Sorted inputs consistently </w:t>
+      </w:r>
+      <w:r>
+        <w:t xml:space="preserve">produced the worst-case performance for the 2-3 tree specifically, while the LLRB and AVL trees were not quite as affected. This is likely </w:t>
+      </w:r>
+      <w:proofErr w:type="gramStart"/>
+      <w:r>
+        <w:t>due to the fact that</w:t>
+      </w:r>
+      <w:proofErr w:type="gramEnd"/>
+      <w:r>
+        <w:t xml:space="preserve"> given sorted insertions, every inserted key will travel the same rightmost path down the tree, resulting in frequent splits as inserted keys consistently overflow 3-nodes on that path.</w:t>
+      </w:r>
+    </w:p>
+    <w:p/>
+    <w:p>
+      <w:pPr>
+        <w:rPr>
+          <w:b/>
+          <w:bCs/>
+        </w:rPr>
+      </w:pPr>
+      <w:r>
+        <w:rPr>
+          <w:b/>
+          <w:bCs/>
+        </w:rPr>
+        <w:t>Edge Cases</w:t>
+      </w:r>
+    </w:p>
+    <w:p>
+      <w:r>
+        <w:t>Duplicate insertions were rejected in all cases. While there were some unexpectedly large disparities between searching for the first and last elements in the 2-3 tree when compared to LLRB and AVL, that disparity varied wildly between runs and is therefore inconclusive.</w:t>
       </w:r>
     </w:p>
     <w:p/>
@@ -897,7 +1034,6 @@
                 <w:rFonts w:ascii="Arial" w:hAnsi="Arial" w:cs="Arial"/>
                 <w:color w:val="000000" w:themeColor="text1"/>
               </w:rPr>
-              <w:lastRenderedPageBreak/>
               <w:t xml:space="preserve"> </w:t>
             </w:r>
           </w:p>

</xml_diff>

<commit_message>
Wrote the comparative analysis
</commit_message>
<xml_diff>
--- a/group_19_COMP0005_report.docx
+++ b/group_19_COMP0005_report.docx
@@ -125,7 +125,7 @@
           <w:sz w:val="32"/>
           <w:szCs w:val="32"/>
         </w:rPr>
-        <w:t>XXX</w:t>
+        <w:t>19</w:t>
       </w:r>
     </w:p>
     <w:p>
@@ -370,7 +370,10 @@
     </w:p>
     <w:p>
       <w:r>
-        <w:t xml:space="preserve">The 2-3 Tree is a self-balancing tree in which each node has either one or two keys, with two or three child nodes respectively. All leaves sit at the same depth, which, theoretically, guarantees an </w:t>
+        <w:t>A</w:t>
+      </w:r>
+      <w:r>
+        <w:t xml:space="preserve"> 2-3 Tree is a self-balancing tree in which each node has either one or two keys, with two or three child nodes respectively. All leaves sit at the same depth, which, theoretically, guarantees an </w:t>
       </w:r>
       <w:proofErr w:type="gramStart"/>
       <w:r>
@@ -574,131 +577,222 @@
           <w:color w:val="BFBFBF" w:themeColor="background1" w:themeShade="BF"/>
         </w:rPr>
       </w:pPr>
-      <w:r>
-        <w:rPr>
-          <w:rFonts w:ascii="Arial" w:hAnsi="Arial" w:cs="Arial"/>
-          <w:i/>
-          <w:iCs/>
-          <w:color w:val="BFBFBF" w:themeColor="background1" w:themeShade="BF"/>
-        </w:rPr>
-        <w:t>(Section</w:t>
-      </w:r>
-      <w:r>
-        <w:rPr>
-          <w:rFonts w:ascii="Arial" w:hAnsi="Arial" w:cs="Arial"/>
-          <w:i/>
-          <w:iCs/>
-          <w:color w:val="BFBFBF" w:themeColor="background1" w:themeShade="BF"/>
-        </w:rPr>
-        <w:t xml:space="preserve"> 3 should be about one</w:t>
-      </w:r>
-      <w:r>
-        <w:rPr>
-          <w:rFonts w:ascii="Arial" w:hAnsi="Arial" w:cs="Arial"/>
-          <w:i/>
-          <w:iCs/>
-          <w:color w:val="BFBFBF" w:themeColor="background1" w:themeShade="BF"/>
-        </w:rPr>
-        <w:t xml:space="preserve"> </w:t>
-      </w:r>
-      <w:r>
-        <w:rPr>
-          <w:rFonts w:ascii="Arial" w:hAnsi="Arial" w:cs="Arial"/>
-          <w:i/>
-          <w:iCs/>
-          <w:color w:val="BFBFBF" w:themeColor="background1" w:themeShade="BF"/>
-        </w:rPr>
-        <w:t>to</w:t>
-      </w:r>
-      <w:r>
-        <w:rPr>
-          <w:rFonts w:ascii="Arial" w:hAnsi="Arial" w:cs="Arial"/>
-          <w:i/>
-          <w:iCs/>
-          <w:color w:val="BFBFBF" w:themeColor="background1" w:themeShade="BF"/>
-        </w:rPr>
-        <w:t xml:space="preserve"> </w:t>
-      </w:r>
-      <w:r>
-        <w:rPr>
-          <w:rFonts w:ascii="Arial" w:hAnsi="Arial" w:cs="Arial"/>
-          <w:i/>
-          <w:iCs/>
-          <w:color w:val="BFBFBF" w:themeColor="background1" w:themeShade="BF"/>
-        </w:rPr>
-        <w:t>one</w:t>
-      </w:r>
-      <w:r>
-        <w:rPr>
-          <w:rFonts w:ascii="Arial" w:hAnsi="Arial" w:cs="Arial"/>
-          <w:i/>
-          <w:iCs/>
-          <w:color w:val="BFBFBF" w:themeColor="background1" w:themeShade="BF"/>
-        </w:rPr>
-        <w:t>-</w:t>
-      </w:r>
-      <w:r>
-        <w:rPr>
-          <w:rFonts w:ascii="Arial" w:hAnsi="Arial" w:cs="Arial"/>
-          <w:i/>
-          <w:iCs/>
-          <w:color w:val="BFBFBF" w:themeColor="background1" w:themeShade="BF"/>
-        </w:rPr>
-        <w:t>and</w:t>
-      </w:r>
-      <w:r>
-        <w:rPr>
-          <w:rFonts w:ascii="Arial" w:hAnsi="Arial" w:cs="Arial"/>
-          <w:i/>
-          <w:iCs/>
-          <w:color w:val="BFBFBF" w:themeColor="background1" w:themeShade="BF"/>
-        </w:rPr>
-        <w:t>-</w:t>
-      </w:r>
-      <w:r>
-        <w:rPr>
-          <w:rFonts w:ascii="Arial" w:hAnsi="Arial" w:cs="Arial"/>
-          <w:i/>
-          <w:iCs/>
-          <w:color w:val="BFBFBF" w:themeColor="background1" w:themeShade="BF"/>
-        </w:rPr>
-        <w:t>a</w:t>
-      </w:r>
-      <w:r>
-        <w:rPr>
-          <w:rFonts w:ascii="Arial" w:hAnsi="Arial" w:cs="Arial"/>
-          <w:i/>
-          <w:iCs/>
-          <w:color w:val="BFBFBF" w:themeColor="background1" w:themeShade="BF"/>
-        </w:rPr>
-        <w:t>-</w:t>
-      </w:r>
-      <w:r>
-        <w:rPr>
-          <w:rFonts w:ascii="Arial" w:hAnsi="Arial" w:cs="Arial"/>
-          <w:i/>
-          <w:iCs/>
-          <w:color w:val="BFBFBF" w:themeColor="background1" w:themeShade="BF"/>
-        </w:rPr>
-        <w:t>half pages</w:t>
-      </w:r>
-      <w:r>
-        <w:rPr>
-          <w:rFonts w:ascii="Arial" w:hAnsi="Arial" w:cs="Arial"/>
-          <w:i/>
-          <w:iCs/>
-          <w:color w:val="BFBFBF" w:themeColor="background1" w:themeShade="BF"/>
-        </w:rPr>
-        <w:t xml:space="preserve"> in length.</w:t>
-      </w:r>
-      <w:r>
-        <w:rPr>
-          <w:rFonts w:ascii="Arial" w:hAnsi="Arial" w:cs="Arial"/>
-          <w:i/>
-          <w:iCs/>
-          <w:color w:val="BFBFBF" w:themeColor="background1" w:themeShade="BF"/>
-        </w:rPr>
-        <w:t>)</w:t>
+    </w:p>
+    <w:p>
+      <w:pPr>
+        <w:rPr>
+          <w:rFonts w:cstheme="minorHAnsi"/>
+        </w:rPr>
+      </w:pPr>
+      <w:r>
+        <w:rPr>
+          <w:rFonts w:cstheme="minorHAnsi"/>
+        </w:rPr>
+        <w:t xml:space="preserve">All three structures share an </w:t>
+      </w:r>
+      <w:proofErr w:type="gramStart"/>
+      <w:r>
+        <w:rPr>
+          <w:rFonts w:cstheme="minorHAnsi"/>
+        </w:rPr>
+        <w:t>O(</w:t>
+      </w:r>
+      <w:proofErr w:type="gramEnd"/>
+      <w:r>
+        <w:rPr>
+          <w:rFonts w:cstheme="minorHAnsi"/>
+        </w:rPr>
+        <w:t xml:space="preserve">log n) worst-case time complexity for both search and insertion, and O(n) space complexity. Despite this theoretical equivalence, however, some practical features in implementation and the experimental results demonstrate significant differences in performance, and trade-offs with each structure. </w:t>
+      </w:r>
+    </w:p>
+    <w:p>
+      <w:pPr>
+        <w:rPr>
+          <w:rFonts w:cstheme="minorHAnsi"/>
+        </w:rPr>
+      </w:pPr>
+    </w:p>
+    <w:p>
+      <w:pPr>
+        <w:rPr>
+          <w:rFonts w:cstheme="minorHAnsi"/>
+        </w:rPr>
+      </w:pPr>
+      <w:r>
+        <w:rPr>
+          <w:rFonts w:cstheme="minorHAnsi"/>
+          <w:b/>
+          <w:bCs/>
+        </w:rPr>
+        <w:t>Insertion</w:t>
+      </w:r>
+    </w:p>
+    <w:p>
+      <w:pPr>
+        <w:rPr>
+          <w:rFonts w:cstheme="minorHAnsi"/>
+        </w:rPr>
+      </w:pPr>
+      <w:r>
+        <w:rPr>
+          <w:rFonts w:cstheme="minorHAnsi"/>
+        </w:rPr>
+        <w:t xml:space="preserve">Insertion performance was broadly comparable across all three data structures, with all three trees scaling consistently with </w:t>
+      </w:r>
+      <w:proofErr w:type="gramStart"/>
+      <w:r>
+        <w:rPr>
+          <w:rFonts w:cstheme="minorHAnsi"/>
+        </w:rPr>
+        <w:t>O(</w:t>
+      </w:r>
+      <w:proofErr w:type="gramEnd"/>
+      <w:r>
+        <w:rPr>
+          <w:rFonts w:cstheme="minorHAnsi"/>
+        </w:rPr>
+        <w:t xml:space="preserve">n log n) total insertion time. The most notable difference was found under sorted input, where the 2-3 tree showed higher insertion times than both LLRB and AVL. This </w:t>
+      </w:r>
+      <w:r>
+        <w:rPr>
+          <w:rFonts w:cstheme="minorHAnsi"/>
+        </w:rPr>
+        <w:t>can be attributed to the split-heavy nature of sorted insertion in 2-3 trees.</w:t>
+      </w:r>
+    </w:p>
+    <w:p>
+      <w:pPr>
+        <w:rPr>
+          <w:rFonts w:cstheme="minorHAnsi"/>
+        </w:rPr>
+      </w:pPr>
+    </w:p>
+    <w:p>
+      <w:pPr>
+        <w:rPr>
+          <w:rFonts w:cstheme="minorHAnsi"/>
+          <w:b/>
+          <w:bCs/>
+        </w:rPr>
+      </w:pPr>
+      <w:r>
+        <w:rPr>
+          <w:rFonts w:cstheme="minorHAnsi"/>
+          <w:b/>
+          <w:bCs/>
+        </w:rPr>
+        <w:t>Search</w:t>
+      </w:r>
+    </w:p>
+    <w:p>
+      <w:pPr>
+        <w:rPr>
+          <w:rFonts w:cstheme="minorHAnsi"/>
+        </w:rPr>
+      </w:pPr>
+      <w:r>
+        <w:rPr>
+          <w:rFonts w:cstheme="minorHAnsi"/>
+        </w:rPr>
+        <w:t xml:space="preserve">Search performance showed the most significant differences between structures. The 2-3 tree was consistently the slowest across all input distributions and search types, in most cases running approximately three times slower than both LLRB and AVL trees at n=50,000. However, the LLRB and AVL trees were largely indistinguishable in search performance across all conditions. </w:t>
+      </w:r>
+    </w:p>
+    <w:p>
+      <w:pPr>
+        <w:rPr>
+          <w:rFonts w:cstheme="minorHAnsi"/>
+        </w:rPr>
+      </w:pPr>
+      <w:r>
+        <w:rPr>
+          <w:rFonts w:cstheme="minorHAnsi"/>
+        </w:rPr>
+        <w:br/>
+        <w:t xml:space="preserve">The 2-3 tree’s search inefficiency stems from overhead due to nodes having up to two keys to check, as well as the use of Python list lookup rather than simple scalar comparison. This is an implementation disadvantage rather than a theoretical one but would be important to note when choosing the best possible data structure. </w:t>
+      </w:r>
+    </w:p>
+    <w:p>
+      <w:pPr>
+        <w:rPr>
+          <w:rFonts w:cstheme="minorHAnsi"/>
+        </w:rPr>
+      </w:pPr>
+    </w:p>
+    <w:p>
+      <w:pPr>
+        <w:rPr>
+          <w:rFonts w:cstheme="minorHAnsi"/>
+          <w:b/>
+          <w:bCs/>
+        </w:rPr>
+      </w:pPr>
+      <w:r>
+        <w:rPr>
+          <w:rFonts w:cstheme="minorHAnsi"/>
+          <w:b/>
+          <w:bCs/>
+        </w:rPr>
+        <w:t>Conclusion</w:t>
+      </w:r>
+    </w:p>
+    <w:p>
+      <w:pPr>
+        <w:rPr>
+          <w:rFonts w:cstheme="minorHAnsi"/>
+        </w:rPr>
+      </w:pPr>
+      <w:r>
+        <w:rPr>
+          <w:rFonts w:cstheme="minorHAnsi"/>
+        </w:rPr>
+        <w:t>Based on the results, AVL trees appear to be the most suitable choice when consistent performance across all conditions is the priority. Its height balancing ensures the most predictable search and insertion times regardless of input order, which is represented in the edge case data.</w:t>
+      </w:r>
+    </w:p>
+    <w:p>
+      <w:pPr>
+        <w:rPr>
+          <w:rFonts w:cstheme="minorHAnsi"/>
+        </w:rPr>
+      </w:pPr>
+    </w:p>
+    <w:p>
+      <w:pPr>
+        <w:rPr>
+          <w:rFonts w:cstheme="minorHAnsi"/>
+        </w:rPr>
+      </w:pPr>
+      <w:r>
+        <w:rPr>
+          <w:rFonts w:cstheme="minorHAnsi"/>
+        </w:rPr>
+        <w:lastRenderedPageBreak/>
+        <w:t xml:space="preserve">LLRB trees were very often able to achieve faster results than AVL, however displayed notable deviations at low to mid data set sizes. While this is likely implementation specific, that would suggest that LLRB trees, while </w:t>
+      </w:r>
+      <w:r>
+        <w:rPr>
+          <w:rFonts w:cstheme="minorHAnsi"/>
+        </w:rPr>
+        <w:t>faster in the best case, risk inconsistency.</w:t>
+      </w:r>
+    </w:p>
+    <w:p>
+      <w:pPr>
+        <w:rPr>
+          <w:rFonts w:cstheme="minorHAnsi"/>
+        </w:rPr>
+      </w:pPr>
+    </w:p>
+    <w:p>
+      <w:pPr>
+        <w:rPr>
+          <w:rFonts w:cstheme="minorHAnsi"/>
+        </w:rPr>
+      </w:pPr>
+      <w:r>
+        <w:rPr>
+          <w:rFonts w:cstheme="minorHAnsi"/>
+        </w:rPr>
+        <w:t>The 2-3 tree performed the worst across all designed experiments. While theoretically equivalent to the other two, it does have practical limitations in implementation, as discussed prior. This may be less significant or not significant in other languages, and can theoretically be designed around, so our experimental results do not represent a conclusive verdict on the viability of 2-3 trees.</w:t>
       </w:r>
     </w:p>
     <w:p>
@@ -738,10 +832,10 @@
         <w:tblLook w:val="04A0" w:firstRow="1" w:lastRow="0" w:firstColumn="1" w:lastColumn="0" w:noHBand="0" w:noVBand="1"/>
       </w:tblPr>
       <w:tblGrid>
-        <w:gridCol w:w="1271"/>
-        <w:gridCol w:w="1559"/>
-        <w:gridCol w:w="4936"/>
-        <w:gridCol w:w="1244"/>
+        <w:gridCol w:w="1249"/>
+        <w:gridCol w:w="2004"/>
+        <w:gridCol w:w="4564"/>
+        <w:gridCol w:w="1193"/>
       </w:tblGrid>
       <w:tr>
         <w:trPr>
@@ -1015,7 +1109,7 @@
       </w:tr>
       <w:tr>
         <w:trPr>
-          <w:trHeight w:hRule="exact" w:val="567"/>
+          <w:trHeight w:hRule="exact" w:val="730"/>
         </w:trPr>
         <w:tc>
           <w:tcPr>
@@ -1035,6 +1129,13 @@
                 <w:color w:val="000000" w:themeColor="text1"/>
               </w:rPr>
               <w:t xml:space="preserve"> </w:t>
+            </w:r>
+            <w:r>
+              <w:rPr>
+                <w:rFonts w:ascii="Arial" w:hAnsi="Arial" w:cs="Arial"/>
+                <w:color w:val="000000" w:themeColor="text1"/>
+              </w:rPr>
+              <w:t>Evan Nguyen</w:t>
             </w:r>
           </w:p>
         </w:tc>
@@ -1050,6 +1151,13 @@
                 <w:color w:val="000000" w:themeColor="text1"/>
               </w:rPr>
             </w:pPr>
+            <w:r>
+              <w:rPr>
+                <w:rFonts w:ascii="Arial" w:hAnsi="Arial" w:cs="Arial"/>
+                <w:color w:val="000000" w:themeColor="text1"/>
+              </w:rPr>
+              <w:t>24161696</w:t>
+            </w:r>
           </w:p>
         </w:tc>
         <w:tc>
@@ -1063,8 +1171,82 @@
               <w:rPr>
                 <w:rFonts w:ascii="Arial" w:hAnsi="Arial" w:cs="Arial"/>
                 <w:color w:val="000000" w:themeColor="text1"/>
+                <w:sz w:val="20"/>
+                <w:szCs w:val="20"/>
               </w:rPr>
             </w:pPr>
+            <w:r>
+              <w:rPr>
+                <w:rFonts w:ascii="Arial" w:hAnsi="Arial" w:cs="Arial"/>
+                <w:color w:val="000000" w:themeColor="text1"/>
+                <w:sz w:val="20"/>
+                <w:szCs w:val="20"/>
+              </w:rPr>
+              <w:t xml:space="preserve">2-3 </w:t>
+            </w:r>
+            <w:r>
+              <w:rPr>
+                <w:rFonts w:ascii="Arial" w:hAnsi="Arial" w:cs="Arial"/>
+                <w:color w:val="000000" w:themeColor="text1"/>
+                <w:sz w:val="20"/>
+                <w:szCs w:val="20"/>
+              </w:rPr>
+              <w:t>tree i</w:t>
+            </w:r>
+            <w:r>
+              <w:rPr>
+                <w:rFonts w:ascii="Arial" w:hAnsi="Arial" w:cs="Arial"/>
+                <w:color w:val="000000" w:themeColor="text1"/>
+                <w:sz w:val="20"/>
+                <w:szCs w:val="20"/>
+              </w:rPr>
+              <w:t>mplementation</w:t>
+            </w:r>
+            <w:r>
+              <w:rPr>
+                <w:rFonts w:ascii="Arial" w:hAnsi="Arial" w:cs="Arial"/>
+                <w:color w:val="000000" w:themeColor="text1"/>
+                <w:sz w:val="20"/>
+                <w:szCs w:val="20"/>
+              </w:rPr>
+              <w:t xml:space="preserve"> and performance results</w:t>
+            </w:r>
+            <w:r>
+              <w:rPr>
+                <w:rFonts w:ascii="Arial" w:hAnsi="Arial" w:cs="Arial"/>
+                <w:color w:val="000000" w:themeColor="text1"/>
+                <w:sz w:val="20"/>
+                <w:szCs w:val="20"/>
+              </w:rPr>
+              <w:t>,</w:t>
+            </w:r>
+            <w:r>
+              <w:rPr>
+                <w:rFonts w:ascii="Arial" w:hAnsi="Arial" w:cs="Arial"/>
+                <w:color w:val="000000" w:themeColor="text1"/>
+                <w:sz w:val="20"/>
+                <w:szCs w:val="20"/>
+              </w:rPr>
+              <w:t xml:space="preserve"> and</w:t>
+            </w:r>
+            <w:r>
+              <w:rPr>
+                <w:rFonts w:ascii="Arial" w:hAnsi="Arial" w:cs="Arial"/>
+                <w:color w:val="000000" w:themeColor="text1"/>
+                <w:sz w:val="20"/>
+                <w:szCs w:val="20"/>
+              </w:rPr>
+              <w:t xml:space="preserve"> </w:t>
+            </w:r>
+            <w:r>
+              <w:rPr>
+                <w:rFonts w:ascii="Arial" w:hAnsi="Arial" w:cs="Arial"/>
+                <w:color w:val="000000" w:themeColor="text1"/>
+                <w:sz w:val="20"/>
+                <w:szCs w:val="20"/>
+              </w:rPr>
+              <w:t>comparative assessment</w:t>
+            </w:r>
           </w:p>
         </w:tc>
         <w:tc>
@@ -1085,7 +1267,14 @@
                 <w:rFonts w:ascii="Arial" w:hAnsi="Arial" w:cs="Arial"/>
                 <w:color w:val="000000" w:themeColor="text1"/>
               </w:rPr>
-              <w:t>… %</w:t>
+              <w:t>25</w:t>
+            </w:r>
+            <w:r>
+              <w:rPr>
+                <w:rFonts w:ascii="Arial" w:hAnsi="Arial" w:cs="Arial"/>
+                <w:color w:val="000000" w:themeColor="text1"/>
+              </w:rPr>
+              <w:t>%</w:t>
             </w:r>
           </w:p>
         </w:tc>
@@ -1192,6 +1381,7 @@
         <w:rPr>
           <w:rFonts w:ascii="Arial" w:hAnsi="Arial" w:cs="Arial"/>
           <w:color w:val="000000" w:themeColor="text1"/>
+          <w:lang w:val="en-US"/>
         </w:rPr>
       </w:pPr>
     </w:p>
@@ -2229,7 +2419,6 @@
   <w:style w:type="character" w:default="1" w:styleId="DefaultParagraphFont">
     <w:name w:val="Default Paragraph Font"/>
     <w:uiPriority w:val="1"/>
-    <w:semiHidden/>
     <w:unhideWhenUsed/>
   </w:style>
   <w:style w:type="table" w:default="1" w:styleId="TableNormal">

</xml_diff>

<commit_message>
Added Section 1 to report
</commit_message>
<xml_diff>
--- a/group_19_COMP0005_report.docx
+++ b/group_19_COMP0005_report.docx
@@ -1,6 +1,6 @@
 
 <file path=word/document.xml><?xml version="1.0" encoding="utf-8"?>
-<w:document xmlns:wpc="http://schemas.microsoft.com/office/word/2010/wordprocessingCanvas" xmlns:cx="http://schemas.microsoft.com/office/drawing/2014/chartex" xmlns:cx1="http://schemas.microsoft.com/office/drawing/2015/9/8/chartex" xmlns:cx2="http://schemas.microsoft.com/office/drawing/2015/10/21/chartex" xmlns:cx3="http://schemas.microsoft.com/office/drawing/2016/5/9/chartex" xmlns:cx4="http://schemas.microsoft.com/office/drawing/2016/5/10/chartex" xmlns:cx5="http://schemas.microsoft.com/office/drawing/2016/5/11/chartex" xmlns:cx6="http://schemas.microsoft.com/office/drawing/2016/5/12/chartex" xmlns:cx7="http://schemas.microsoft.com/office/drawing/2016/5/13/chartex" xmlns:cx8="http://schemas.microsoft.com/office/drawing/2016/5/14/chartex" xmlns:mc="http://schemas.openxmlformats.org/markup-compatibility/2006" xmlns:aink="http://schemas.microsoft.com/office/drawing/2016/ink" xmlns:am3d="http://schemas.microsoft.com/office/drawing/2017/model3d" xmlns:o="urn:schemas-microsoft-com:office:office" xmlns:oel="http://schemas.microsoft.com/office/2019/extlst" xmlns:r="http://schemas.openxmlformats.org/officeDocument/2006/relationships" xmlns:m="http://schemas.openxmlformats.org/officeDocument/2006/math" xmlns:v="urn:schemas-microsoft-com:vml" xmlns:wp14="http://schemas.microsoft.com/office/word/2010/wordprocessingDrawing" xmlns:wp="http://schemas.openxmlformats.org/drawingml/2006/wordprocessingDrawing" xmlns:w10="urn:schemas-microsoft-com:office:word" xmlns:w="http://schemas.openxmlformats.org/wordprocessingml/2006/main" xmlns:w14="http://schemas.microsoft.com/office/word/2010/wordml" xmlns:w15="http://schemas.microsoft.com/office/word/2012/wordml" xmlns:w16cex="http://schemas.microsoft.com/office/word/2018/wordml/cex" xmlns:w16cid="http://schemas.microsoft.com/office/word/2016/wordml/cid" xmlns:w16="http://schemas.microsoft.com/office/word/2018/wordml" xmlns:w16du="http://schemas.microsoft.com/office/word/2023/wordml/word16du" xmlns:w16sdtdh="http://schemas.microsoft.com/office/word/2020/wordml/sdtdatahash" xmlns:w16sdtfl="http://schemas.microsoft.com/office/word/2024/wordml/sdtformatlock" xmlns:w16se="http://schemas.microsoft.com/office/word/2015/wordml/symex" xmlns:wpg="http://schemas.microsoft.com/office/word/2010/wordprocessingGroup" xmlns:wpi="http://schemas.microsoft.com/office/word/2010/wordprocessingInk" xmlns:wne="http://schemas.microsoft.com/office/word/2006/wordml" xmlns:wps="http://schemas.microsoft.com/office/word/2010/wordprocessingShape" mc:Ignorable="w14 w15 w16se w16cid w16 w16cex w16sdtdh w16sdtfl w16du wp14">
+<w:document xmlns:wpc="http://schemas.microsoft.com/office/word/2010/wordprocessingCanvas" xmlns:cx="http://schemas.microsoft.com/office/drawing/2014/chartex" xmlns:cx1="http://schemas.microsoft.com/office/drawing/2015/9/8/chartex" xmlns:cx2="http://schemas.microsoft.com/office/drawing/2015/10/21/chartex" xmlns:cx3="http://schemas.microsoft.com/office/drawing/2016/5/9/chartex" xmlns:cx4="http://schemas.microsoft.com/office/drawing/2016/5/10/chartex" xmlns:cx5="http://schemas.microsoft.com/office/drawing/2016/5/11/chartex" xmlns:cx6="http://schemas.microsoft.com/office/drawing/2016/5/12/chartex" xmlns:cx7="http://schemas.microsoft.com/office/drawing/2016/5/13/chartex" xmlns:cx8="http://schemas.microsoft.com/office/drawing/2016/5/14/chartex" xmlns:mc="http://schemas.openxmlformats.org/markup-compatibility/2006" xmlns:aink="http://schemas.microsoft.com/office/drawing/2016/ink" xmlns:am3d="http://schemas.microsoft.com/office/drawing/2017/model3d" xmlns:o="urn:schemas-microsoft-com:office:office" xmlns:oel="http://schemas.microsoft.com/office/2019/extlst" xmlns:r="http://schemas.openxmlformats.org/officeDocument/2006/relationships" xmlns:m="http://schemas.openxmlformats.org/officeDocument/2006/math" xmlns:v="urn:schemas-microsoft-com:vml" xmlns:wp14="http://schemas.microsoft.com/office/word/2010/wordprocessingDrawing" xmlns:wp="http://schemas.openxmlformats.org/drawingml/2006/wordprocessingDrawing" xmlns:w10="urn:schemas-microsoft-com:office:word" xmlns:w="http://schemas.openxmlformats.org/wordprocessingml/2006/main" xmlns:w14="http://schemas.microsoft.com/office/word/2010/wordml" xmlns:w15="http://schemas.microsoft.com/office/word/2012/wordml" xmlns:w16cex="http://schemas.microsoft.com/office/word/2018/wordml/cex" xmlns:w16cid="http://schemas.microsoft.com/office/word/2016/wordml/cid" xmlns:w16="http://schemas.microsoft.com/office/word/2018/wordml" xmlns:w16sdtdh="http://schemas.microsoft.com/office/word/2020/wordml/sdtdatahash" xmlns:w16se="http://schemas.microsoft.com/office/word/2015/wordml/symex" xmlns:wpg="http://schemas.microsoft.com/office/word/2010/wordprocessingGroup" xmlns:wpi="http://schemas.microsoft.com/office/word/2010/wordprocessingInk" xmlns:wne="http://schemas.microsoft.com/office/word/2006/wordml" xmlns:wps="http://schemas.microsoft.com/office/word/2010/wordprocessingShape" mc:Ignorable="w14 w15 w16se w16cid w16 w16cex w16sdtdh wp14">
   <w:body>
     <w:p>
       <w:pPr>
@@ -267,6 +267,96 @@
     </w:p>
     <w:p/>
     <w:p>
+      <w:r>
+        <w:t>The experimental framework is designed to evaluate the performance of three search data structures: the Left-Leaning Red-Black (LLRB) BST, 2-3 Tree, and AVL Tree. To guarantee a standardized comparison, all implementations inherit from an AbstractSearchInterface, which enforces identical signatures for insertElement and searchElement methods. As the sets are assumed to only grow over time, deletion operations are excluded from the scope of this implementation. The framework is built entirely from scratch, utilizing only the permitted Python libraries: </w:t>
+      </w:r>
+      <w:proofErr w:type="spellStart"/>
+      <w:r>
+        <w:t>timeit</w:t>
+      </w:r>
+      <w:proofErr w:type="spellEnd"/>
+      <w:r>
+        <w:t>, random, string, and matplotlib.</w:t>
+      </w:r>
+    </w:p>
+    <w:p/>
+    <w:p>
+      <w:pPr>
+        <w:rPr>
+          <w:b/>
+          <w:bCs/>
+        </w:rPr>
+      </w:pPr>
+      <w:r>
+        <w:rPr>
+          <w:b/>
+          <w:bCs/>
+        </w:rPr>
+        <w:t>Synthetic Data Generation </w:t>
+      </w:r>
+    </w:p>
+    <w:p>
+      <w:r>
+        <w:t>To thoroughly test the algorithms under varying conditions, a TestDataGenerator class generates synthetic string datasets of multiple sizes {1000,5000,10000,25000,50000}. To assess how content distribution impacts structural balance, the framework generates three distinct types of datasets:</w:t>
+      </w:r>
+    </w:p>
+    <w:p>
+      <w:r>
+        <w:t>Random Strings: 5-character alphanumeric strings to evaluate average-case performance.</w:t>
+      </w:r>
+    </w:p>
+    <w:p>
+      <w:r>
+        <w:t>Sorted Strings: Sequentially ordered strings to act as a stress test for the self-balancing mechanisms of each tree.</w:t>
+      </w:r>
+    </w:p>
+    <w:p>
+      <w:r>
+        <w:t>Prefix Strings: Strings sharing a 15-character common prefix followed by a random 5-character suffix, testing the computational overhead of expensive string comparisons.</w:t>
+      </w:r>
+    </w:p>
+    <w:p/>
+    <w:p>
+      <w:pPr>
+        <w:rPr>
+          <w:b/>
+          <w:bCs/>
+        </w:rPr>
+      </w:pPr>
+      <w:r>
+        <w:rPr>
+          <w:b/>
+          <w:bCs/>
+        </w:rPr>
+        <w:t>Measurement Methodology </w:t>
+      </w:r>
+    </w:p>
+    <w:p>
+      <w:r>
+        <w:t>The ExperimentalFramework class isolates algorithmic execution time from data generation overhead. The timeit library is strictly utilized to measure only the execution of tree operations; the timer initiates only after the test data lists are fully constructed in memory and halts immediately upon completion of the insertions or searches.</w:t>
+      </w:r>
+    </w:p>
+    <w:p>
+      <w:r>
+        <w:t>Search performance is evaluated across two primary scenarios: successful searches (querying a sample of elements guaranteed to be in the tree) and unsuccessful searches (querying elements explicitly generated to be absent from the set). To minimize the impact of operating system background processes, the measurement is executed over five independent runs</w:t>
+      </w:r>
+      <w:r>
+        <w:t xml:space="preserve">, </w:t>
+      </w:r>
+      <w:r>
+        <w:t>computing the mean and standard deviation for each metric. Finally, an edge-case testing module is included to assess specific scenarios, such as the handling of duplicate insertions and the time discrepancy when searching for the first versus the last inserted element.</w:t>
+      </w:r>
+    </w:p>
+    <w:p>
+      <w:pPr>
+        <w:rPr>
+          <w:rFonts w:hint="eastAsia"/>
+          <w:lang w:val="en-US" w:eastAsia="zh-CN"/>
+        </w:rPr>
+      </w:pPr>
+    </w:p>
+    <w:p/>
+    <w:p>
       <w:pPr>
         <w:pStyle w:val="Heading2"/>
         <w:rPr>
@@ -476,15 +566,7 @@
         <w:t xml:space="preserve">Sorted inputs consistently </w:t>
       </w:r>
       <w:r>
-        <w:t xml:space="preserve">produced the worst-case performance for the 2-3 tree specifically, while the LLRB and AVL trees were not quite as affected. This is likely </w:t>
-      </w:r>
-      <w:proofErr w:type="gramStart"/>
-      <w:r>
-        <w:t>due to the fact that</w:t>
-      </w:r>
-      <w:proofErr w:type="gramEnd"/>
-      <w:r>
-        <w:t xml:space="preserve"> given sorted insertions, every inserted key will travel the same rightmost path down the tree, resulting in frequent splits as inserted keys consistently overflow 3-nodes on that path.</w:t>
+        <w:t>produced the worst-case performance for the 2-3 tree specifically, while the LLRB and AVL trees were not quite as affected. This is likely due to the fact that given sorted insertions, every inserted key will travel the same rightmost path down the tree, resulting in frequent splits as inserted keys consistently overflow 3-nodes on that path.</w:t>
       </w:r>
     </w:p>
     <w:p/>
@@ -565,6 +647,7 @@
           <w:rFonts w:ascii="Arial" w:hAnsi="Arial" w:cs="Arial"/>
           <w:color w:val="000000" w:themeColor="text1"/>
         </w:rPr>
+        <w:lastRenderedPageBreak/>
         <w:t>Comparative Assessment</w:t>
       </w:r>
     </w:p>
@@ -765,7 +848,6 @@
         <w:rPr>
           <w:rFonts w:cstheme="minorHAnsi"/>
         </w:rPr>
-        <w:lastRenderedPageBreak/>
         <w:t xml:space="preserve">LLRB trees were very often able to achieve faster results than AVL, however displayed notable deviations at low to mid data set sizes. While this is likely implementation specific, that would suggest that LLRB trees, while </w:t>
       </w:r>
       <w:r>
@@ -863,6 +945,7 @@
                 <w:bCs/>
                 <w:color w:val="000000" w:themeColor="text1"/>
               </w:rPr>
+              <w:lastRenderedPageBreak/>
               <w:t>Student Name</w:t>
             </w:r>
           </w:p>
@@ -1042,8 +1125,9 @@
           <w:p>
             <w:pPr>
               <w:rPr>
-                <w:rFonts w:ascii="Arial" w:hAnsi="Arial" w:cs="Arial"/>
-                <w:color w:val="000000" w:themeColor="text1"/>
+                <w:rFonts w:ascii="Arial" w:hAnsi="Arial" w:cs="Arial" w:hint="eastAsia"/>
+                <w:color w:val="000000" w:themeColor="text1"/>
+                <w:lang w:val="en-US" w:eastAsia="zh-CN"/>
               </w:rPr>
             </w:pPr>
             <w:r>
@@ -1293,6 +1377,7 @@
               <w:rPr>
                 <w:rFonts w:ascii="Arial" w:hAnsi="Arial" w:cs="Arial"/>
                 <w:color w:val="000000" w:themeColor="text1"/>
+                <w:lang w:val="en-US"/>
               </w:rPr>
             </w:pPr>
             <w:r>
@@ -1301,6 +1386,22 @@
                 <w:color w:val="000000" w:themeColor="text1"/>
               </w:rPr>
               <w:t xml:space="preserve"> </w:t>
+            </w:r>
+            <w:r>
+              <w:rPr>
+                <w:rFonts w:ascii="Arial" w:hAnsi="Arial" w:cs="Arial" w:hint="eastAsia"/>
+                <w:color w:val="000000" w:themeColor="text1"/>
+                <w:lang w:eastAsia="zh-CN"/>
+              </w:rPr>
+              <w:t>Yajun</w:t>
+            </w:r>
+            <w:r>
+              <w:rPr>
+                <w:rFonts w:ascii="Arial" w:hAnsi="Arial" w:cs="Arial"/>
+                <w:color w:val="000000" w:themeColor="text1"/>
+                <w:lang w:val="en-US" w:eastAsia="zh-CN"/>
+              </w:rPr>
+              <w:t xml:space="preserve"> He</w:t>
             </w:r>
           </w:p>
         </w:tc>
@@ -1316,6 +1417,13 @@
                 <w:color w:val="000000" w:themeColor="text1"/>
               </w:rPr>
             </w:pPr>
+            <w:r>
+              <w:rPr>
+                <w:rFonts w:ascii="Arial" w:hAnsi="Arial" w:cs="Arial"/>
+                <w:color w:val="000000" w:themeColor="text1"/>
+              </w:rPr>
+              <w:t>25004885</w:t>
+            </w:r>
           </w:p>
         </w:tc>
         <w:tc>
@@ -1323,6 +1431,14 @@
             <w:tcW w:w="4936" w:type="dxa"/>
             <w:vAlign w:val="center"/>
           </w:tcPr>
+          <w:p>
+            <w:r>
+              <w:t xml:space="preserve">             </w:t>
+            </w:r>
+            <w:r>
+              <w:t>Synthetic Data Generation </w:t>
+            </w:r>
+          </w:p>
           <w:p>
             <w:pPr>
               <w:ind w:left="360"/>
@@ -1396,7 +1512,7 @@
 </file>
 
 <file path=word/endnotes.xml><?xml version="1.0" encoding="utf-8"?>
-<w:endnotes xmlns:wpc="http://schemas.microsoft.com/office/word/2010/wordprocessingCanvas" xmlns:cx="http://schemas.microsoft.com/office/drawing/2014/chartex" xmlns:cx1="http://schemas.microsoft.com/office/drawing/2015/9/8/chartex" xmlns:cx2="http://schemas.microsoft.com/office/drawing/2015/10/21/chartex" xmlns:cx3="http://schemas.microsoft.com/office/drawing/2016/5/9/chartex" xmlns:cx4="http://schemas.microsoft.com/office/drawing/2016/5/10/chartex" xmlns:cx5="http://schemas.microsoft.com/office/drawing/2016/5/11/chartex" xmlns:cx6="http://schemas.microsoft.com/office/drawing/2016/5/12/chartex" xmlns:cx7="http://schemas.microsoft.com/office/drawing/2016/5/13/chartex" xmlns:cx8="http://schemas.microsoft.com/office/drawing/2016/5/14/chartex" xmlns:mc="http://schemas.openxmlformats.org/markup-compatibility/2006" xmlns:aink="http://schemas.microsoft.com/office/drawing/2016/ink" xmlns:am3d="http://schemas.microsoft.com/office/drawing/2017/model3d" xmlns:o="urn:schemas-microsoft-com:office:office" xmlns:oel="http://schemas.microsoft.com/office/2019/extlst" xmlns:r="http://schemas.openxmlformats.org/officeDocument/2006/relationships" xmlns:m="http://schemas.openxmlformats.org/officeDocument/2006/math" xmlns:v="urn:schemas-microsoft-com:vml" xmlns:wp14="http://schemas.microsoft.com/office/word/2010/wordprocessingDrawing" xmlns:wp="http://schemas.openxmlformats.org/drawingml/2006/wordprocessingDrawing" xmlns:w10="urn:schemas-microsoft-com:office:word" xmlns:w="http://schemas.openxmlformats.org/wordprocessingml/2006/main" xmlns:w14="http://schemas.microsoft.com/office/word/2010/wordml" xmlns:w15="http://schemas.microsoft.com/office/word/2012/wordml" xmlns:w16cex="http://schemas.microsoft.com/office/word/2018/wordml/cex" xmlns:w16cid="http://schemas.microsoft.com/office/word/2016/wordml/cid" xmlns:w16="http://schemas.microsoft.com/office/word/2018/wordml" xmlns:w16du="http://schemas.microsoft.com/office/word/2023/wordml/word16du" xmlns:w16sdtdh="http://schemas.microsoft.com/office/word/2020/wordml/sdtdatahash" xmlns:w16sdtfl="http://schemas.microsoft.com/office/word/2024/wordml/sdtformatlock" xmlns:w16se="http://schemas.microsoft.com/office/word/2015/wordml/symex" xmlns:wpg="http://schemas.microsoft.com/office/word/2010/wordprocessingGroup" xmlns:wpi="http://schemas.microsoft.com/office/word/2010/wordprocessingInk" xmlns:wne="http://schemas.microsoft.com/office/word/2006/wordml" xmlns:wps="http://schemas.microsoft.com/office/word/2010/wordprocessingShape" mc:Ignorable="w14 w15 w16se w16cid w16 w16cex w16sdtdh w16sdtfl w16du wp14">
+<w:endnotes xmlns:wpc="http://schemas.microsoft.com/office/word/2010/wordprocessingCanvas" xmlns:cx="http://schemas.microsoft.com/office/drawing/2014/chartex" xmlns:cx1="http://schemas.microsoft.com/office/drawing/2015/9/8/chartex" xmlns:cx2="http://schemas.microsoft.com/office/drawing/2015/10/21/chartex" xmlns:cx3="http://schemas.microsoft.com/office/drawing/2016/5/9/chartex" xmlns:cx4="http://schemas.microsoft.com/office/drawing/2016/5/10/chartex" xmlns:cx5="http://schemas.microsoft.com/office/drawing/2016/5/11/chartex" xmlns:cx6="http://schemas.microsoft.com/office/drawing/2016/5/12/chartex" xmlns:cx7="http://schemas.microsoft.com/office/drawing/2016/5/13/chartex" xmlns:cx8="http://schemas.microsoft.com/office/drawing/2016/5/14/chartex" xmlns:mc="http://schemas.openxmlformats.org/markup-compatibility/2006" xmlns:aink="http://schemas.microsoft.com/office/drawing/2016/ink" xmlns:am3d="http://schemas.microsoft.com/office/drawing/2017/model3d" xmlns:o="urn:schemas-microsoft-com:office:office" xmlns:oel="http://schemas.microsoft.com/office/2019/extlst" xmlns:r="http://schemas.openxmlformats.org/officeDocument/2006/relationships" xmlns:m="http://schemas.openxmlformats.org/officeDocument/2006/math" xmlns:v="urn:schemas-microsoft-com:vml" xmlns:wp14="http://schemas.microsoft.com/office/word/2010/wordprocessingDrawing" xmlns:wp="http://schemas.openxmlformats.org/drawingml/2006/wordprocessingDrawing" xmlns:w10="urn:schemas-microsoft-com:office:word" xmlns:w="http://schemas.openxmlformats.org/wordprocessingml/2006/main" xmlns:w14="http://schemas.microsoft.com/office/word/2010/wordml" xmlns:w15="http://schemas.microsoft.com/office/word/2012/wordml" xmlns:w16cex="http://schemas.microsoft.com/office/word/2018/wordml/cex" xmlns:w16cid="http://schemas.microsoft.com/office/word/2016/wordml/cid" xmlns:w16="http://schemas.microsoft.com/office/word/2018/wordml" xmlns:w16sdtdh="http://schemas.microsoft.com/office/word/2020/wordml/sdtdatahash" xmlns:w16se="http://schemas.microsoft.com/office/word/2015/wordml/symex" xmlns:wpg="http://schemas.microsoft.com/office/word/2010/wordprocessingGroup" xmlns:wpi="http://schemas.microsoft.com/office/word/2010/wordprocessingInk" xmlns:wne="http://schemas.microsoft.com/office/word/2006/wordml" xmlns:wps="http://schemas.microsoft.com/office/word/2010/wordprocessingShape" mc:Ignorable="w14 w15 w16se w16cid w16 w16cex w16sdtdh wp14">
   <w:endnote w:type="separator" w:id="-1">
     <w:p>
       <w:r>
@@ -1415,7 +1531,7 @@
 </file>
 
 <file path=word/footnotes.xml><?xml version="1.0" encoding="utf-8"?>
-<w:footnotes xmlns:wpc="http://schemas.microsoft.com/office/word/2010/wordprocessingCanvas" xmlns:cx="http://schemas.microsoft.com/office/drawing/2014/chartex" xmlns:cx1="http://schemas.microsoft.com/office/drawing/2015/9/8/chartex" xmlns:cx2="http://schemas.microsoft.com/office/drawing/2015/10/21/chartex" xmlns:cx3="http://schemas.microsoft.com/office/drawing/2016/5/9/chartex" xmlns:cx4="http://schemas.microsoft.com/office/drawing/2016/5/10/chartex" xmlns:cx5="http://schemas.microsoft.com/office/drawing/2016/5/11/chartex" xmlns:cx6="http://schemas.microsoft.com/office/drawing/2016/5/12/chartex" xmlns:cx7="http://schemas.microsoft.com/office/drawing/2016/5/13/chartex" xmlns:cx8="http://schemas.microsoft.com/office/drawing/2016/5/14/chartex" xmlns:mc="http://schemas.openxmlformats.org/markup-compatibility/2006" xmlns:aink="http://schemas.microsoft.com/office/drawing/2016/ink" xmlns:am3d="http://schemas.microsoft.com/office/drawing/2017/model3d" xmlns:o="urn:schemas-microsoft-com:office:office" xmlns:oel="http://schemas.microsoft.com/office/2019/extlst" xmlns:r="http://schemas.openxmlformats.org/officeDocument/2006/relationships" xmlns:m="http://schemas.openxmlformats.org/officeDocument/2006/math" xmlns:v="urn:schemas-microsoft-com:vml" xmlns:wp14="http://schemas.microsoft.com/office/word/2010/wordprocessingDrawing" xmlns:wp="http://schemas.openxmlformats.org/drawingml/2006/wordprocessingDrawing" xmlns:w10="urn:schemas-microsoft-com:office:word" xmlns:w="http://schemas.openxmlformats.org/wordprocessingml/2006/main" xmlns:w14="http://schemas.microsoft.com/office/word/2010/wordml" xmlns:w15="http://schemas.microsoft.com/office/word/2012/wordml" xmlns:w16cex="http://schemas.microsoft.com/office/word/2018/wordml/cex" xmlns:w16cid="http://schemas.microsoft.com/office/word/2016/wordml/cid" xmlns:w16="http://schemas.microsoft.com/office/word/2018/wordml" xmlns:w16du="http://schemas.microsoft.com/office/word/2023/wordml/word16du" xmlns:w16sdtdh="http://schemas.microsoft.com/office/word/2020/wordml/sdtdatahash" xmlns:w16sdtfl="http://schemas.microsoft.com/office/word/2024/wordml/sdtformatlock" xmlns:w16se="http://schemas.microsoft.com/office/word/2015/wordml/symex" xmlns:wpg="http://schemas.microsoft.com/office/word/2010/wordprocessingGroup" xmlns:wpi="http://schemas.microsoft.com/office/word/2010/wordprocessingInk" xmlns:wne="http://schemas.microsoft.com/office/word/2006/wordml" xmlns:wps="http://schemas.microsoft.com/office/word/2010/wordprocessingShape" mc:Ignorable="w14 w15 w16se w16cid w16 w16cex w16sdtdh w16sdtfl w16du wp14">
+<w:footnotes xmlns:wpc="http://schemas.microsoft.com/office/word/2010/wordprocessingCanvas" xmlns:cx="http://schemas.microsoft.com/office/drawing/2014/chartex" xmlns:cx1="http://schemas.microsoft.com/office/drawing/2015/9/8/chartex" xmlns:cx2="http://schemas.microsoft.com/office/drawing/2015/10/21/chartex" xmlns:cx3="http://schemas.microsoft.com/office/drawing/2016/5/9/chartex" xmlns:cx4="http://schemas.microsoft.com/office/drawing/2016/5/10/chartex" xmlns:cx5="http://schemas.microsoft.com/office/drawing/2016/5/11/chartex" xmlns:cx6="http://schemas.microsoft.com/office/drawing/2016/5/12/chartex" xmlns:cx7="http://schemas.microsoft.com/office/drawing/2016/5/13/chartex" xmlns:cx8="http://schemas.microsoft.com/office/drawing/2016/5/14/chartex" xmlns:mc="http://schemas.openxmlformats.org/markup-compatibility/2006" xmlns:aink="http://schemas.microsoft.com/office/drawing/2016/ink" xmlns:am3d="http://schemas.microsoft.com/office/drawing/2017/model3d" xmlns:o="urn:schemas-microsoft-com:office:office" xmlns:oel="http://schemas.microsoft.com/office/2019/extlst" xmlns:r="http://schemas.openxmlformats.org/officeDocument/2006/relationships" xmlns:m="http://schemas.openxmlformats.org/officeDocument/2006/math" xmlns:v="urn:schemas-microsoft-com:vml" xmlns:wp14="http://schemas.microsoft.com/office/word/2010/wordprocessingDrawing" xmlns:wp="http://schemas.openxmlformats.org/drawingml/2006/wordprocessingDrawing" xmlns:w10="urn:schemas-microsoft-com:office:word" xmlns:w="http://schemas.openxmlformats.org/wordprocessingml/2006/main" xmlns:w14="http://schemas.microsoft.com/office/word/2010/wordml" xmlns:w15="http://schemas.microsoft.com/office/word/2012/wordml" xmlns:w16cex="http://schemas.microsoft.com/office/word/2018/wordml/cex" xmlns:w16cid="http://schemas.microsoft.com/office/word/2016/wordml/cid" xmlns:w16="http://schemas.microsoft.com/office/word/2018/wordml" xmlns:w16sdtdh="http://schemas.microsoft.com/office/word/2020/wordml/sdtdatahash" xmlns:w16se="http://schemas.microsoft.com/office/word/2015/wordml/symex" xmlns:wpg="http://schemas.microsoft.com/office/word/2010/wordprocessingGroup" xmlns:wpi="http://schemas.microsoft.com/office/word/2010/wordprocessingInk" xmlns:wne="http://schemas.microsoft.com/office/word/2006/wordml" xmlns:wps="http://schemas.microsoft.com/office/word/2010/wordprocessingShape" mc:Ignorable="w14 w15 w16se w16cid w16 w16cex w16sdtdh wp14">
   <w:footnote w:type="separator" w:id="-1">
     <w:p>
       <w:r>
@@ -1476,7 +1592,7 @@
 </file>
 
 <file path=word/numbering.xml><?xml version="1.0" encoding="utf-8"?>
-<w:numbering xmlns:wpc="http://schemas.microsoft.com/office/word/2010/wordprocessingCanvas" xmlns:cx="http://schemas.microsoft.com/office/drawing/2014/chartex" xmlns:cx1="http://schemas.microsoft.com/office/drawing/2015/9/8/chartex" xmlns:cx2="http://schemas.microsoft.com/office/drawing/2015/10/21/chartex" xmlns:cx3="http://schemas.microsoft.com/office/drawing/2016/5/9/chartex" xmlns:cx4="http://schemas.microsoft.com/office/drawing/2016/5/10/chartex" xmlns:cx5="http://schemas.microsoft.com/office/drawing/2016/5/11/chartex" xmlns:cx6="http://schemas.microsoft.com/office/drawing/2016/5/12/chartex" xmlns:cx7="http://schemas.microsoft.com/office/drawing/2016/5/13/chartex" xmlns:cx8="http://schemas.microsoft.com/office/drawing/2016/5/14/chartex" xmlns:mc="http://schemas.openxmlformats.org/markup-compatibility/2006" xmlns:aink="http://schemas.microsoft.com/office/drawing/2016/ink" xmlns:am3d="http://schemas.microsoft.com/office/drawing/2017/model3d" xmlns:o="urn:schemas-microsoft-com:office:office" xmlns:oel="http://schemas.microsoft.com/office/2019/extlst" xmlns:r="http://schemas.openxmlformats.org/officeDocument/2006/relationships" xmlns:m="http://schemas.openxmlformats.org/officeDocument/2006/math" xmlns:v="urn:schemas-microsoft-com:vml" xmlns:wp14="http://schemas.microsoft.com/office/word/2010/wordprocessingDrawing" xmlns:wp="http://schemas.openxmlformats.org/drawingml/2006/wordprocessingDrawing" xmlns:w10="urn:schemas-microsoft-com:office:word" xmlns:w="http://schemas.openxmlformats.org/wordprocessingml/2006/main" xmlns:w14="http://schemas.microsoft.com/office/word/2010/wordml" xmlns:w15="http://schemas.microsoft.com/office/word/2012/wordml" xmlns:w16cex="http://schemas.microsoft.com/office/word/2018/wordml/cex" xmlns:w16cid="http://schemas.microsoft.com/office/word/2016/wordml/cid" xmlns:w16="http://schemas.microsoft.com/office/word/2018/wordml" xmlns:w16du="http://schemas.microsoft.com/office/word/2023/wordml/word16du" xmlns:w16sdtdh="http://schemas.microsoft.com/office/word/2020/wordml/sdtdatahash" xmlns:w16sdtfl="http://schemas.microsoft.com/office/word/2024/wordml/sdtformatlock" xmlns:w16se="http://schemas.microsoft.com/office/word/2015/wordml/symex" xmlns:wpg="http://schemas.microsoft.com/office/word/2010/wordprocessingGroup" xmlns:wpi="http://schemas.microsoft.com/office/word/2010/wordprocessingInk" xmlns:wne="http://schemas.microsoft.com/office/word/2006/wordml" xmlns:wps="http://schemas.microsoft.com/office/word/2010/wordprocessingShape" mc:Ignorable="w14 w15 w16se w16cid w16 w16cex w16sdtdh w16sdtfl w16du wp14">
+<w:numbering xmlns:wpc="http://schemas.microsoft.com/office/word/2010/wordprocessingCanvas" xmlns:cx="http://schemas.microsoft.com/office/drawing/2014/chartex" xmlns:cx1="http://schemas.microsoft.com/office/drawing/2015/9/8/chartex" xmlns:cx2="http://schemas.microsoft.com/office/drawing/2015/10/21/chartex" xmlns:cx3="http://schemas.microsoft.com/office/drawing/2016/5/9/chartex" xmlns:cx4="http://schemas.microsoft.com/office/drawing/2016/5/10/chartex" xmlns:cx5="http://schemas.microsoft.com/office/drawing/2016/5/11/chartex" xmlns:cx6="http://schemas.microsoft.com/office/drawing/2016/5/12/chartex" xmlns:cx7="http://schemas.microsoft.com/office/drawing/2016/5/13/chartex" xmlns:cx8="http://schemas.microsoft.com/office/drawing/2016/5/14/chartex" xmlns:mc="http://schemas.openxmlformats.org/markup-compatibility/2006" xmlns:aink="http://schemas.microsoft.com/office/drawing/2016/ink" xmlns:am3d="http://schemas.microsoft.com/office/drawing/2017/model3d" xmlns:o="urn:schemas-microsoft-com:office:office" xmlns:oel="http://schemas.microsoft.com/office/2019/extlst" xmlns:r="http://schemas.openxmlformats.org/officeDocument/2006/relationships" xmlns:m="http://schemas.openxmlformats.org/officeDocument/2006/math" xmlns:v="urn:schemas-microsoft-com:vml" xmlns:wp14="http://schemas.microsoft.com/office/word/2010/wordprocessingDrawing" xmlns:wp="http://schemas.openxmlformats.org/drawingml/2006/wordprocessingDrawing" xmlns:w10="urn:schemas-microsoft-com:office:word" xmlns:w="http://schemas.openxmlformats.org/wordprocessingml/2006/main" xmlns:w14="http://schemas.microsoft.com/office/word/2010/wordml" xmlns:w15="http://schemas.microsoft.com/office/word/2012/wordml" xmlns:w16cex="http://schemas.microsoft.com/office/word/2018/wordml/cex" xmlns:w16cid="http://schemas.microsoft.com/office/word/2016/wordml/cid" xmlns:w16="http://schemas.microsoft.com/office/word/2018/wordml" xmlns:w16sdtdh="http://schemas.microsoft.com/office/word/2020/wordml/sdtdatahash" xmlns:w16se="http://schemas.microsoft.com/office/word/2015/wordml/symex" xmlns:wpg="http://schemas.microsoft.com/office/word/2010/wordprocessingGroup" xmlns:wpi="http://schemas.microsoft.com/office/word/2010/wordprocessingInk" xmlns:wne="http://schemas.microsoft.com/office/word/2006/wordml" xmlns:wps="http://schemas.microsoft.com/office/word/2010/wordprocessingShape" mc:Ignorable="w14 w15 w16se w16cid w16 w16cex w16sdtdh wp14">
   <w:abstractNum w:abstractNumId="0" w15:restartNumberingAfterBreak="0">
     <w:nsid w:val="237153FF"/>
     <w:multiLevelType w:val="hybridMultilevel"/>
@@ -1591,6 +1707,155 @@
     </w:lvl>
   </w:abstractNum>
   <w:abstractNum w:abstractNumId="1" w15:restartNumberingAfterBreak="0">
+    <w:nsid w:val="68F54D0B"/>
+    <w:multiLevelType w:val="multilevel"/>
+    <w:tmpl w:val="D5B06A26"/>
+    <w:lvl w:ilvl="0">
+      <w:start w:val="1"/>
+      <w:numFmt w:val="bullet"/>
+      <w:lvlText w:val=""/>
+      <w:lvlJc w:val="left"/>
+      <w:pPr>
+        <w:tabs>
+          <w:tab w:val="num" w:pos="720"/>
+        </w:tabs>
+        <w:ind w:left="720" w:hanging="360"/>
+      </w:pPr>
+      <w:rPr>
+        <w:rFonts w:ascii="Symbol" w:hAnsi="Symbol" w:hint="default"/>
+        <w:sz w:val="20"/>
+      </w:rPr>
+    </w:lvl>
+    <w:lvl w:ilvl="1" w:tentative="1">
+      <w:start w:val="1"/>
+      <w:numFmt w:val="bullet"/>
+      <w:lvlText w:val="o"/>
+      <w:lvlJc w:val="left"/>
+      <w:pPr>
+        <w:tabs>
+          <w:tab w:val="num" w:pos="1440"/>
+        </w:tabs>
+        <w:ind w:left="1440" w:hanging="360"/>
+      </w:pPr>
+      <w:rPr>
+        <w:rFonts w:ascii="Courier New" w:hAnsi="Courier New" w:hint="default"/>
+        <w:sz w:val="20"/>
+      </w:rPr>
+    </w:lvl>
+    <w:lvl w:ilvl="2" w:tentative="1">
+      <w:start w:val="1"/>
+      <w:numFmt w:val="bullet"/>
+      <w:lvlText w:val=""/>
+      <w:lvlJc w:val="left"/>
+      <w:pPr>
+        <w:tabs>
+          <w:tab w:val="num" w:pos="2160"/>
+        </w:tabs>
+        <w:ind w:left="2160" w:hanging="360"/>
+      </w:pPr>
+      <w:rPr>
+        <w:rFonts w:ascii="Wingdings" w:hAnsi="Wingdings" w:hint="default"/>
+        <w:sz w:val="20"/>
+      </w:rPr>
+    </w:lvl>
+    <w:lvl w:ilvl="3" w:tentative="1">
+      <w:start w:val="1"/>
+      <w:numFmt w:val="bullet"/>
+      <w:lvlText w:val=""/>
+      <w:lvlJc w:val="left"/>
+      <w:pPr>
+        <w:tabs>
+          <w:tab w:val="num" w:pos="2880"/>
+        </w:tabs>
+        <w:ind w:left="2880" w:hanging="360"/>
+      </w:pPr>
+      <w:rPr>
+        <w:rFonts w:ascii="Wingdings" w:hAnsi="Wingdings" w:hint="default"/>
+        <w:sz w:val="20"/>
+      </w:rPr>
+    </w:lvl>
+    <w:lvl w:ilvl="4" w:tentative="1">
+      <w:start w:val="1"/>
+      <w:numFmt w:val="bullet"/>
+      <w:lvlText w:val=""/>
+      <w:lvlJc w:val="left"/>
+      <w:pPr>
+        <w:tabs>
+          <w:tab w:val="num" w:pos="3600"/>
+        </w:tabs>
+        <w:ind w:left="3600" w:hanging="360"/>
+      </w:pPr>
+      <w:rPr>
+        <w:rFonts w:ascii="Wingdings" w:hAnsi="Wingdings" w:hint="default"/>
+        <w:sz w:val="20"/>
+      </w:rPr>
+    </w:lvl>
+    <w:lvl w:ilvl="5" w:tentative="1">
+      <w:start w:val="1"/>
+      <w:numFmt w:val="bullet"/>
+      <w:lvlText w:val=""/>
+      <w:lvlJc w:val="left"/>
+      <w:pPr>
+        <w:tabs>
+          <w:tab w:val="num" w:pos="4320"/>
+        </w:tabs>
+        <w:ind w:left="4320" w:hanging="360"/>
+      </w:pPr>
+      <w:rPr>
+        <w:rFonts w:ascii="Wingdings" w:hAnsi="Wingdings" w:hint="default"/>
+        <w:sz w:val="20"/>
+      </w:rPr>
+    </w:lvl>
+    <w:lvl w:ilvl="6" w:tentative="1">
+      <w:start w:val="1"/>
+      <w:numFmt w:val="bullet"/>
+      <w:lvlText w:val=""/>
+      <w:lvlJc w:val="left"/>
+      <w:pPr>
+        <w:tabs>
+          <w:tab w:val="num" w:pos="5040"/>
+        </w:tabs>
+        <w:ind w:left="5040" w:hanging="360"/>
+      </w:pPr>
+      <w:rPr>
+        <w:rFonts w:ascii="Wingdings" w:hAnsi="Wingdings" w:hint="default"/>
+        <w:sz w:val="20"/>
+      </w:rPr>
+    </w:lvl>
+    <w:lvl w:ilvl="7" w:tentative="1">
+      <w:start w:val="1"/>
+      <w:numFmt w:val="bullet"/>
+      <w:lvlText w:val=""/>
+      <w:lvlJc w:val="left"/>
+      <w:pPr>
+        <w:tabs>
+          <w:tab w:val="num" w:pos="5760"/>
+        </w:tabs>
+        <w:ind w:left="5760" w:hanging="360"/>
+      </w:pPr>
+      <w:rPr>
+        <w:rFonts w:ascii="Wingdings" w:hAnsi="Wingdings" w:hint="default"/>
+        <w:sz w:val="20"/>
+      </w:rPr>
+    </w:lvl>
+    <w:lvl w:ilvl="8" w:tentative="1">
+      <w:start w:val="1"/>
+      <w:numFmt w:val="bullet"/>
+      <w:lvlText w:val=""/>
+      <w:lvlJc w:val="left"/>
+      <w:pPr>
+        <w:tabs>
+          <w:tab w:val="num" w:pos="6480"/>
+        </w:tabs>
+        <w:ind w:left="6480" w:hanging="360"/>
+      </w:pPr>
+      <w:rPr>
+        <w:rFonts w:ascii="Wingdings" w:hAnsi="Wingdings" w:hint="default"/>
+        <w:sz w:val="20"/>
+      </w:rPr>
+    </w:lvl>
+  </w:abstractNum>
+  <w:abstractNum w:abstractNumId="2" w15:restartNumberingAfterBreak="0">
     <w:nsid w:val="69F81985"/>
     <w:multiLevelType w:val="hybridMultilevel"/>
     <w:tmpl w:val="B82ACF8C"/>
@@ -1679,7 +1944,7 @@
       </w:pPr>
     </w:lvl>
   </w:abstractNum>
-  <w:abstractNum w:abstractNumId="2" w15:restartNumberingAfterBreak="0">
+  <w:abstractNum w:abstractNumId="3" w15:restartNumberingAfterBreak="0">
     <w:nsid w:val="74C91BE5"/>
     <w:multiLevelType w:val="multilevel"/>
     <w:tmpl w:val="08090025"/>
@@ -1778,20 +2043,23 @@
     <w:abstractNumId w:val="0"/>
   </w:num>
   <w:num w:numId="2" w16cid:durableId="971907529">
-    <w:abstractNumId w:val="1"/>
+    <w:abstractNumId w:val="2"/>
   </w:num>
   <w:num w:numId="3" w16cid:durableId="1503088180">
-    <w:abstractNumId w:val="2"/>
+    <w:abstractNumId w:val="3"/>
+  </w:num>
+  <w:num w:numId="4" w16cid:durableId="1566915903">
+    <w:abstractNumId w:val="1"/>
   </w:num>
 </w:numbering>
 </file>
 
 <file path=word/styles.xml><?xml version="1.0" encoding="utf-8"?>
-<w:styles xmlns:mc="http://schemas.openxmlformats.org/markup-compatibility/2006" xmlns:r="http://schemas.openxmlformats.org/officeDocument/2006/relationships" xmlns:w="http://schemas.openxmlformats.org/wordprocessingml/2006/main" xmlns:w14="http://schemas.microsoft.com/office/word/2010/wordml" xmlns:w15="http://schemas.microsoft.com/office/word/2012/wordml" xmlns:w16cex="http://schemas.microsoft.com/office/word/2018/wordml/cex" xmlns:w16cid="http://schemas.microsoft.com/office/word/2016/wordml/cid" xmlns:w16="http://schemas.microsoft.com/office/word/2018/wordml" xmlns:w16du="http://schemas.microsoft.com/office/word/2023/wordml/word16du" xmlns:w16sdtdh="http://schemas.microsoft.com/office/word/2020/wordml/sdtdatahash" xmlns:w16sdtfl="http://schemas.microsoft.com/office/word/2024/wordml/sdtformatlock" xmlns:w16se="http://schemas.microsoft.com/office/word/2015/wordml/symex" mc:Ignorable="w14 w15 w16se w16cid w16 w16cex w16sdtdh w16sdtfl w16du">
+<w:styles xmlns:mc="http://schemas.openxmlformats.org/markup-compatibility/2006" xmlns:r="http://schemas.openxmlformats.org/officeDocument/2006/relationships" xmlns:w="http://schemas.openxmlformats.org/wordprocessingml/2006/main" xmlns:w14="http://schemas.microsoft.com/office/word/2010/wordml" xmlns:w15="http://schemas.microsoft.com/office/word/2012/wordml" xmlns:w16cex="http://schemas.microsoft.com/office/word/2018/wordml/cex" xmlns:w16cid="http://schemas.microsoft.com/office/word/2016/wordml/cid" xmlns:w16="http://schemas.microsoft.com/office/word/2018/wordml" xmlns:w16sdtdh="http://schemas.microsoft.com/office/word/2020/wordml/sdtdatahash" xmlns:w16se="http://schemas.microsoft.com/office/word/2015/wordml/symex" mc:Ignorable="w14 w15 w16se w16cid w16 w16cex w16sdtdh">
   <w:docDefaults>
     <w:rPrDefault>
       <w:rPr>
-        <w:rFonts w:asciiTheme="minorHAnsi" w:eastAsiaTheme="minorHAnsi" w:hAnsiTheme="minorHAnsi" w:cstheme="minorBidi"/>
+        <w:rFonts w:asciiTheme="minorHAnsi" w:eastAsia="SimSun" w:hAnsiTheme="minorHAnsi" w:cstheme="minorBidi"/>
         <w:sz w:val="24"/>
         <w:szCs w:val="24"/>
         <w:lang w:val="en-GB" w:eastAsia="en-US" w:bidi="ar-SA"/>
@@ -2419,6 +2687,7 @@
   <w:style w:type="character" w:default="1" w:styleId="DefaultParagraphFont">
     <w:name w:val="Default Paragraph Font"/>
     <w:uiPriority w:val="1"/>
+    <w:semiHidden/>
     <w:unhideWhenUsed/>
   </w:style>
   <w:style w:type="table" w:default="1" w:styleId="TableNormal">
@@ -2624,6 +2893,64 @@
       <w:sz w:val="21"/>
       <w:szCs w:val="21"/>
     </w:rPr>
+  </w:style>
+  <w:style w:type="paragraph" w:styleId="NormalWeb">
+    <w:name w:val="Normal (Web)"/>
+    <w:basedOn w:val="Normal"/>
+    <w:uiPriority w:val="99"/>
+    <w:semiHidden/>
+    <w:unhideWhenUsed/>
+    <w:rsid w:val="005006BE"/>
+    <w:pPr>
+      <w:spacing w:before="100" w:beforeAutospacing="1" w:after="100" w:afterAutospacing="1"/>
+    </w:pPr>
+    <w:rPr>
+      <w:rFonts w:ascii="Times New Roman" w:eastAsia="Times New Roman" w:hAnsi="Times New Roman" w:cs="Times New Roman"/>
+      <w:lang w:val="en-CN" w:eastAsia="zh-CN"/>
+    </w:rPr>
+  </w:style>
+  <w:style w:type="character" w:customStyle="1" w:styleId="apple-converted-space">
+    <w:name w:val="apple-converted-space"/>
+    <w:basedOn w:val="DefaultParagraphFont"/>
+    <w:rsid w:val="005006BE"/>
+  </w:style>
+  <w:style w:type="character" w:styleId="HTMLCode">
+    <w:name w:val="HTML Code"/>
+    <w:basedOn w:val="DefaultParagraphFont"/>
+    <w:uiPriority w:val="99"/>
+    <w:semiHidden/>
+    <w:unhideWhenUsed/>
+    <w:rsid w:val="005006BE"/>
+    <w:rPr>
+      <w:rFonts w:ascii="Courier New" w:eastAsia="Times New Roman" w:hAnsi="Courier New" w:cs="Courier New"/>
+      <w:sz w:val="20"/>
+      <w:szCs w:val="20"/>
+    </w:rPr>
+  </w:style>
+  <w:style w:type="character" w:customStyle="1" w:styleId="mord">
+    <w:name w:val="mord"/>
+    <w:basedOn w:val="DefaultParagraphFont"/>
+    <w:rsid w:val="005006BE"/>
+  </w:style>
+  <w:style w:type="character" w:customStyle="1" w:styleId="mrel">
+    <w:name w:val="mrel"/>
+    <w:basedOn w:val="DefaultParagraphFont"/>
+    <w:rsid w:val="005006BE"/>
+  </w:style>
+  <w:style w:type="character" w:customStyle="1" w:styleId="mopen">
+    <w:name w:val="mopen"/>
+    <w:basedOn w:val="DefaultParagraphFont"/>
+    <w:rsid w:val="005006BE"/>
+  </w:style>
+  <w:style w:type="character" w:customStyle="1" w:styleId="mpunct">
+    <w:name w:val="mpunct"/>
+    <w:basedOn w:val="DefaultParagraphFont"/>
+    <w:rsid w:val="005006BE"/>
+  </w:style>
+  <w:style w:type="character" w:customStyle="1" w:styleId="mclose">
+    <w:name w:val="mclose"/>
+    <w:basedOn w:val="DefaultParagraphFont"/>
+    <w:rsid w:val="005006BE"/>
   </w:style>
 </w:styles>
 </file>

</xml_diff>

<commit_message>
Added AVL to word for completeness
</commit_message>
<xml_diff>
--- a/group_19_COMP0005_report.docx
+++ b/group_19_COMP0005_report.docx
@@ -603,7 +603,101 @@
           <w:rFonts w:ascii="Arial" w:hAnsi="Arial" w:cs="Arial"/>
           <w:color w:val="000000" w:themeColor="text1"/>
         </w:rPr>
-        <w:t>[Second Chosen Data Structure]</w:t>
+        <w:t>AVL</w:t>
+      </w:r>
+    </w:p>
+    <w:p>
+      <w:r>
+        <w:t xml:space="preserve">The AVL tree is a self-balancing binary search tree that maintains a balance factor (the difference between left and right subtree heights) of at most 1 at every node. After each insertion, the tree checks the balance factor and performs rotations (left, right, left-right, or right-left) to restore balance. This guarantees </w:t>
+      </w:r>
+      <w:proofErr w:type="gramStart"/>
+      <w:r>
+        <w:t>O(</w:t>
+      </w:r>
+      <w:proofErr w:type="gramEnd"/>
+      <w:r>
+        <w:t xml:space="preserve">log n) worst-case time complexity for both insert and search operations. </w:t>
+      </w:r>
+    </w:p>
+    <w:p/>
+    <w:p>
+      <w:pPr>
+        <w:rPr>
+          <w:b/>
+          <w:bCs/>
+        </w:rPr>
+      </w:pPr>
+      <w:r>
+        <w:rPr>
+          <w:b/>
+          <w:bCs/>
+        </w:rPr>
+        <w:lastRenderedPageBreak/>
+        <w:t xml:space="preserve">Insertion </w:t>
+      </w:r>
+    </w:p>
+    <w:p>
+      <w:r>
+        <w:t xml:space="preserve">For random data, the AVL tree’s total insertion time grew from approximately 0.002 s at 1,000 elements to 0.17 s at 50,000 elements. With sorted data, performance was similar, demonstrating that AVL’s rebalancing effectively prevents the degenerate linear behaviour that an unbalanced BST would exhibit. Prefix data produced the slowest insertion times, reaching approximately 0.23 s at 50,000 elements. This is because strings sharing a long common prefix require more character comparisons before a difference is found, increasing the cost of each comparison operation. The per-element insertion time remained relatively stable across dataset sizes, and the log-log plot shows approximately linear growth, consistent with the expected </w:t>
+      </w:r>
+      <w:proofErr w:type="gramStart"/>
+      <w:r>
+        <w:t>O(</w:t>
+      </w:r>
+      <w:proofErr w:type="gramEnd"/>
+      <w:r>
+        <w:t xml:space="preserve">n log n) total insertion cost. </w:t>
+      </w:r>
+    </w:p>
+    <w:p>
+      <w:pPr>
+        <w:rPr>
+          <w:b/>
+          <w:bCs/>
+        </w:rPr>
+      </w:pPr>
+    </w:p>
+    <w:p>
+      <w:r>
+        <w:rPr>
+          <w:b/>
+          <w:bCs/>
+        </w:rPr>
+        <w:t>Search</w:t>
+      </w:r>
+      <w:r>
+        <w:t xml:space="preserve"> </w:t>
+      </w:r>
+    </w:p>
+    <w:p>
+      <w:r>
+        <w:t xml:space="preserve">AVL search times were consistently lower than the 2-3 tree across all search types and data distributions, though slightly higher than LLRB in most cases. For random search queries on random data, AVL’s average search time grew from approximately 0.4 µs at 1,000 elements to 0.7 µs at 50,000 elements, confirming the expected </w:t>
+      </w:r>
+      <w:proofErr w:type="gramStart"/>
+      <w:r>
+        <w:t>O(</w:t>
+      </w:r>
+      <w:proofErr w:type="gramEnd"/>
+      <w:r>
+        <w:t xml:space="preserve">log n) growth. Searching for elements known to be in the set produced similar times to random searches, while searching for elements not in the set was marginally faster since failed searches terminate at a null child without a final comparison. </w:t>
+      </w:r>
+    </w:p>
+    <w:p/>
+    <w:p>
+      <w:r>
+        <w:rPr>
+          <w:b/>
+          <w:bCs/>
+        </w:rPr>
+        <w:t>Edge cases</w:t>
+      </w:r>
+      <w:r>
+        <w:t xml:space="preserve"> </w:t>
+      </w:r>
+    </w:p>
+    <w:p>
+      <w:r>
+        <w:t>Duplicate insertions were correctly rejected (all returned False), with a total time of 0.00015 s for 100 duplicate attempts. Searching for the first inserted element (8.47 × 10−8 s) was faster than searching for the last inserted element (7.59 × 10−7 s), which reflects the different depths at which these elements sit in the balanced tree.</w:t>
       </w:r>
     </w:p>
     <w:p/>
@@ -633,29 +727,21 @@
     <w:p>
       <w:pPr>
         <w:rPr>
-          <w:rFonts w:ascii="Arial" w:eastAsiaTheme="majorEastAsia" w:hAnsi="Arial" w:cs="Arial"/>
-          <w:color w:val="000000" w:themeColor="text1"/>
-        </w:rPr>
-      </w:pPr>
-      <w:r>
-        <w:rPr>
-          <w:rFonts w:ascii="Arial" w:eastAsiaTheme="majorEastAsia" w:hAnsi="Arial" w:cs="Arial"/>
-          <w:color w:val="000000" w:themeColor="text1"/>
-        </w:rPr>
-        <w:t xml:space="preserve">The Left-Leaning Red Black Binary Search Tree (LLRBBST) is a self-balancing binary search tree in which each edge is assigned a colour, either red or black. It has a specific order: every red edge must be going left, and there can never be two red edges in a row. If this order is ever broken, the tree will perform as many rotations </w:t>
-      </w:r>
-      <w:r>
-        <w:rPr>
-          <w:rFonts w:ascii="Arial" w:eastAsiaTheme="majorEastAsia" w:hAnsi="Arial" w:cs="Arial"/>
-          <w:color w:val="000000" w:themeColor="text1"/>
-        </w:rPr>
-        <w:lastRenderedPageBreak/>
-        <w:t xml:space="preserve">and colour flips as needed to restore it. Trying to work with edges directly can be tedious, so in most implementations we assign the colour of an edge to the node that it points to. Here, every node that is inserted is automatically assigned red, and the tree is balanced if needed. Like the other trees, it has a theoretical time complexity of </w:t>
+          <w:rFonts w:eastAsiaTheme="majorEastAsia" w:cstheme="minorHAnsi"/>
+          <w:color w:val="000000" w:themeColor="text1"/>
+        </w:rPr>
+      </w:pPr>
+      <w:r>
+        <w:rPr>
+          <w:rFonts w:eastAsiaTheme="majorEastAsia" w:cstheme="minorHAnsi"/>
+          <w:color w:val="000000" w:themeColor="text1"/>
+        </w:rPr>
+        <w:t xml:space="preserve">The Left-Leaning Red Black Binary Search Tree (LLRBBST) is a self-balancing binary search tree in which each edge is assigned a colour, either red or black. It has a specific order: every red edge must be going left, and there can never be two red edges in a row. If this order is ever broken, the tree will perform as many rotations and colour flips as needed to restore it. Trying to work with edges directly can be tedious, so in most implementations we assign the colour of an edge to the node that it points to. Here, every node that is inserted is automatically assigned red, and the tree is balanced if needed. Like the other trees, it has a theoretical time complexity of </w:t>
       </w:r>
       <w:proofErr w:type="gramStart"/>
       <w:r>
         <w:rPr>
-          <w:rFonts w:ascii="Arial" w:eastAsiaTheme="majorEastAsia" w:hAnsi="Arial" w:cs="Arial"/>
+          <w:rFonts w:eastAsiaTheme="majorEastAsia" w:cstheme="minorHAnsi"/>
           <w:color w:val="000000" w:themeColor="text1"/>
         </w:rPr>
         <w:t>O(</w:t>
@@ -663,7 +749,7 @@
       <w:proofErr w:type="gramEnd"/>
       <w:r>
         <w:rPr>
-          <w:rFonts w:ascii="Arial" w:eastAsiaTheme="majorEastAsia" w:hAnsi="Arial" w:cs="Arial"/>
+          <w:rFonts w:eastAsiaTheme="majorEastAsia" w:cstheme="minorHAnsi"/>
           <w:color w:val="000000" w:themeColor="text1"/>
         </w:rPr>
         <w:t>log n) for single element search and insert.</w:t>
@@ -783,6 +869,7 @@
           <w:b/>
           <w:bCs/>
         </w:rPr>
+        <w:lastRenderedPageBreak/>
         <w:t>Insertion</w:t>
       </w:r>
     </w:p>
@@ -796,7 +883,19 @@
         <w:rPr>
           <w:rFonts w:cstheme="minorHAnsi"/>
         </w:rPr>
-        <w:t xml:space="preserve">Insertion performance was broadly comparable across all three data structures, with all three trees scaling consistently with </w:t>
+        <w:t xml:space="preserve">Insertion performance was broadly comparable across all three data structures, </w:t>
+      </w:r>
+      <w:r>
+        <w:rPr>
+          <w:rFonts w:cstheme="minorHAnsi"/>
+        </w:rPr>
+        <w:t xml:space="preserve">slightly </w:t>
+      </w:r>
+      <w:r>
+        <w:rPr>
+          <w:rFonts w:cstheme="minorHAnsi"/>
+        </w:rPr>
+        <w:t xml:space="preserve">with all three trees scaling consistently with </w:t>
       </w:r>
       <w:proofErr w:type="gramStart"/>
       <w:r>
@@ -950,7 +1049,6 @@
         <w:rPr>
           <w:rFonts w:cstheme="minorHAnsi"/>
         </w:rPr>
-        <w:lastRenderedPageBreak/>
         <w:t>The 2-3 tree performed the worst across all designed experiments. While theoretically equivalent to the other two, it does have practical limitations in implementation, as discussed prior. This may be less significant or not significant in other languages, and can theoretically be designed around, so our experimental results do not represent a conclusive verdict on the viability of 2-3 trees.</w:t>
       </w:r>
     </w:p>
@@ -1353,6 +1451,7 @@
                 <w:rFonts w:ascii="Arial" w:hAnsi="Arial" w:cs="Arial"/>
                 <w:color w:val="000000" w:themeColor="text1"/>
               </w:rPr>
+              <w:lastRenderedPageBreak/>
               <w:t xml:space="preserve"> </w:t>
             </w:r>
             <w:r>

</xml_diff>

<commit_message>
Cleaned up code and comments, fixed data in report.
</commit_message>
<xml_diff>
--- a/group_19_COMP0005_report.docx
+++ b/group_19_COMP0005_report.docx
@@ -193,61 +193,6 @@
         <w:t>Overview of Experimental Framework</w:t>
       </w:r>
     </w:p>
-    <w:p>
-      <w:pPr>
-        <w:rPr>
-          <w:rFonts w:ascii="Arial" w:hAnsi="Arial" w:cs="Arial"/>
-          <w:i/>
-          <w:iCs/>
-          <w:color w:val="BFBFBF" w:themeColor="background1" w:themeShade="BF"/>
-        </w:rPr>
-      </w:pPr>
-      <w:r>
-        <w:rPr>
-          <w:rFonts w:ascii="Arial" w:hAnsi="Arial" w:cs="Arial"/>
-          <w:i/>
-          <w:iCs/>
-          <w:color w:val="BFBFBF" w:themeColor="background1" w:themeShade="BF"/>
-        </w:rPr>
-        <w:t xml:space="preserve">(Section 1 should be </w:t>
-      </w:r>
-      <w:r>
-        <w:rPr>
-          <w:rFonts w:ascii="Arial" w:hAnsi="Arial" w:cs="Arial"/>
-          <w:i/>
-          <w:iCs/>
-          <w:color w:val="BFBFBF" w:themeColor="background1" w:themeShade="BF"/>
-        </w:rPr>
-        <w:t>about</w:t>
-      </w:r>
-      <w:r>
-        <w:rPr>
-          <w:rFonts w:ascii="Arial" w:hAnsi="Arial" w:cs="Arial"/>
-          <w:i/>
-          <w:iCs/>
-          <w:color w:val="BFBFBF" w:themeColor="background1" w:themeShade="BF"/>
-        </w:rPr>
-        <w:t xml:space="preserve"> one page</w:t>
-      </w:r>
-      <w:r>
-        <w:rPr>
-          <w:rFonts w:ascii="Arial" w:hAnsi="Arial" w:cs="Arial"/>
-          <w:i/>
-          <w:iCs/>
-          <w:color w:val="BFBFBF" w:themeColor="background1" w:themeShade="BF"/>
-        </w:rPr>
-        <w:t xml:space="preserve"> in length.</w:t>
-      </w:r>
-      <w:r>
-        <w:rPr>
-          <w:rFonts w:ascii="Arial" w:hAnsi="Arial" w:cs="Arial"/>
-          <w:i/>
-          <w:iCs/>
-          <w:color w:val="BFBFBF" w:themeColor="background1" w:themeShade="BF"/>
-        </w:rPr>
-        <w:t>)</w:t>
-      </w:r>
-    </w:p>
     <w:p/>
     <w:p>
       <w:pPr>
@@ -268,7 +213,45 @@
     <w:p/>
     <w:p>
       <w:r>
-        <w:t>The experimental framework is designed to evaluate the performance of three search data structures: the Left-Leaning Red-Black (LLRB) BST, 2-3 Tree, and AVL Tree. To guarantee a standardized comparison, all implementations inherit from an AbstractSearchInterface, which enforces identical signatures for insertElement and searchElement methods. As the sets are assumed to only grow over time, deletion operations are excluded from the scope of this implementation. The framework is built entirely from scratch, utilizing only the permitted Python libraries: timeit, random, string, and matplotlib.</w:t>
+        <w:t xml:space="preserve">The experimental framework is designed to evaluate the performance of three search data structures: the Left-Leaning </w:t>
+      </w:r>
+      <w:r>
+        <w:t>Red Black</w:t>
+      </w:r>
+      <w:r>
+        <w:t xml:space="preserve"> (LLRB) BST, 2-3 Tree, and AVL Tree. To guarantee a standardized comparison, all implementations inherit from an </w:t>
+      </w:r>
+      <w:proofErr w:type="spellStart"/>
+      <w:r>
+        <w:t>AbstractSearchInterface</w:t>
+      </w:r>
+      <w:proofErr w:type="spellEnd"/>
+      <w:r>
+        <w:t>, which enforces identical signatures for </w:t>
+      </w:r>
+      <w:proofErr w:type="spellStart"/>
+      <w:r>
+        <w:t>insertElement</w:t>
+      </w:r>
+      <w:proofErr w:type="spellEnd"/>
+      <w:r>
+        <w:t> and </w:t>
+      </w:r>
+      <w:proofErr w:type="spellStart"/>
+      <w:r>
+        <w:t>searchElement</w:t>
+      </w:r>
+      <w:proofErr w:type="spellEnd"/>
+      <w:r>
+        <w:t> methods. As the sets are assumed to only grow over time, deletion operations are excluded from the scope of this implementation. The framework is built entirely from scratch, utilizing only the permitted Python libraries: </w:t>
+      </w:r>
+      <w:proofErr w:type="spellStart"/>
+      <w:r>
+        <w:t>timeit</w:t>
+      </w:r>
+      <w:proofErr w:type="spellEnd"/>
+      <w:r>
+        <w:t>, random, string, and matplotlib.</w:t>
       </w:r>
     </w:p>
     <w:p/>
@@ -289,7 +272,15 @@
     </w:p>
     <w:p>
       <w:r>
-        <w:t>To thoroughly test the algorithms under varying conditions, a TestDataGenerator class generates synthetic string datasets of multiple sizes {1000,5000,10000,25000,50000}. To assess how content distribution impacts structural balance, the framework generates three distinct types of datasets:</w:t>
+        <w:t>To thoroughly test the algorithms under varying conditions, a </w:t>
+      </w:r>
+      <w:proofErr w:type="spellStart"/>
+      <w:r>
+        <w:t>TestDataGenerator</w:t>
+      </w:r>
+      <w:proofErr w:type="spellEnd"/>
+      <w:r>
+        <w:t> class generates synthetic string datasets of multiple sizes {1000,5000,10000,25000,50000}. To assess how content distribution impacts structural balance, the framework generates three distinct types of datasets:</w:t>
       </w:r>
     </w:p>
     <w:p>
@@ -325,7 +316,23 @@
     </w:p>
     <w:p>
       <w:r>
-        <w:t>The ExperimentalFramework class isolates algorithmic execution time from data generation overhead. The timeit library is strictly utilized to measure only the execution of tree operations; the timer initiates only after the test data lists are fully constructed in memory and halts immediately upon completion of the insertions or searches.</w:t>
+        <w:t>The </w:t>
+      </w:r>
+      <w:proofErr w:type="spellStart"/>
+      <w:r>
+        <w:t>ExperimentalFramework</w:t>
+      </w:r>
+      <w:proofErr w:type="spellEnd"/>
+      <w:r>
+        <w:t> class isolates algorithmic execution time from data generation overhead. The </w:t>
+      </w:r>
+      <w:proofErr w:type="spellStart"/>
+      <w:r>
+        <w:t>timeit</w:t>
+      </w:r>
+      <w:proofErr w:type="spellEnd"/>
+      <w:r>
+        <w:t> library is strictly utilized to measure only the execution of tree operations; the timer initiates only after the test data lists are fully constructed in memory and halts immediately upon completion of the insertions or searches.</w:t>
       </w:r>
     </w:p>
     <w:p>
@@ -360,6 +367,7 @@
           <w:rFonts w:ascii="Arial" w:hAnsi="Arial" w:cs="Arial"/>
           <w:color w:val="000000" w:themeColor="text1"/>
         </w:rPr>
+        <w:lastRenderedPageBreak/>
         <w:t>Hardware/Software Setup for Experimentation</w:t>
       </w:r>
     </w:p>
@@ -391,7 +399,39 @@
           <w:rFonts w:ascii="Arial" w:hAnsi="Arial" w:cs="Arial"/>
           <w:color w:val="000000" w:themeColor="text1"/>
         </w:rPr>
-        <w:t>In terms of software, this program was run on a Jupyter Notebook in the VSCode IDE with Python 3.11.9.</w:t>
+        <w:t xml:space="preserve">In terms of software, this program was run on a </w:t>
+      </w:r>
+      <w:proofErr w:type="spellStart"/>
+      <w:r>
+        <w:rPr>
+          <w:rFonts w:ascii="Arial" w:hAnsi="Arial" w:cs="Arial"/>
+          <w:color w:val="000000" w:themeColor="text1"/>
+        </w:rPr>
+        <w:t>Jupyter</w:t>
+      </w:r>
+      <w:proofErr w:type="spellEnd"/>
+      <w:r>
+        <w:rPr>
+          <w:rFonts w:ascii="Arial" w:hAnsi="Arial" w:cs="Arial"/>
+          <w:color w:val="000000" w:themeColor="text1"/>
+        </w:rPr>
+        <w:t xml:space="preserve"> Notebook in the </w:t>
+      </w:r>
+      <w:proofErr w:type="spellStart"/>
+      <w:r>
+        <w:rPr>
+          <w:rFonts w:ascii="Arial" w:hAnsi="Arial" w:cs="Arial"/>
+          <w:color w:val="000000" w:themeColor="text1"/>
+        </w:rPr>
+        <w:t>VSCode</w:t>
+      </w:r>
+      <w:proofErr w:type="spellEnd"/>
+      <w:r>
+        <w:rPr>
+          <w:rFonts w:ascii="Arial" w:hAnsi="Arial" w:cs="Arial"/>
+          <w:color w:val="000000" w:themeColor="text1"/>
+        </w:rPr>
+        <w:t xml:space="preserve"> IDE with Python 3.11.9.</w:t>
       </w:r>
     </w:p>
     <w:p>
@@ -418,43 +458,6 @@
         <w:t>Performance Results</w:t>
       </w:r>
     </w:p>
-    <w:p>
-      <w:pPr>
-        <w:rPr>
-          <w:rFonts w:ascii="Arial" w:hAnsi="Arial" w:cs="Arial"/>
-          <w:i/>
-          <w:iCs/>
-          <w:color w:val="BFBFBF" w:themeColor="background1" w:themeShade="BF"/>
-        </w:rPr>
-      </w:pPr>
-      <w:r>
-        <w:rPr>
-          <w:rFonts w:ascii="Arial" w:hAnsi="Arial" w:cs="Arial"/>
-          <w:i/>
-          <w:iCs/>
-          <w:color w:val="BFBFBF" w:themeColor="background1" w:themeShade="BF"/>
-        </w:rPr>
-        <w:t>(Section</w:t>
-      </w:r>
-      <w:r>
-        <w:rPr>
-          <w:rFonts w:ascii="Arial" w:hAnsi="Arial" w:cs="Arial"/>
-          <w:i/>
-          <w:iCs/>
-          <w:color w:val="BFBFBF" w:themeColor="background1" w:themeShade="BF"/>
-        </w:rPr>
-        <w:t xml:space="preserve"> 2 should be about two to two-and-a-half pages in length.</w:t>
-      </w:r>
-      <w:r>
-        <w:rPr>
-          <w:rFonts w:ascii="Arial" w:hAnsi="Arial" w:cs="Arial"/>
-          <w:i/>
-          <w:iCs/>
-          <w:color w:val="BFBFBF" w:themeColor="background1" w:themeShade="BF"/>
-        </w:rPr>
-        <w:t>)</w:t>
-      </w:r>
-    </w:p>
     <w:p/>
     <w:p>
       <w:pPr>
@@ -477,7 +480,15 @@
         <w:t>A</w:t>
       </w:r>
       <w:r>
-        <w:t xml:space="preserve"> 2-3 Tree is a self-balancing tree in which each node has either one or two keys, with two or three child nodes respectively. All leaves sit at the same depth, which, theoretically, guarantees an O(log n) wors</w:t>
+        <w:t xml:space="preserve"> 2-3 Tree is a self-balancing tree in which each node has either one or two keys, with two or three child nodes respectively. All leaves sit at the same depth, which, theoretically, guarantees an </w:t>
+      </w:r>
+      <w:proofErr w:type="gramStart"/>
+      <w:r>
+        <w:t>O(</w:t>
+      </w:r>
+      <w:proofErr w:type="gramEnd"/>
+      <w:r>
+        <w:t>log n) wors</w:t>
       </w:r>
       <w:r>
         <w:t>t</w:t>
@@ -516,7 +527,15 @@
         <w:t>n and</w:t>
       </w:r>
       <w:r>
-        <w:t xml:space="preserve"> were consistent with an O(n log n) </w:t>
+        <w:t xml:space="preserve"> were consistent with an </w:t>
+      </w:r>
+      <w:proofErr w:type="gramStart"/>
+      <w:r>
+        <w:t>O(</w:t>
+      </w:r>
+      <w:proofErr w:type="gramEnd"/>
+      <w:r>
+        <w:t xml:space="preserve">n log n) </w:t>
       </w:r>
       <w:r>
         <w:t xml:space="preserve">total </w:t>
@@ -527,6 +546,21 @@
       <w:r>
         <w:t>This is consistent with the theoretical worst-case complexity.</w:t>
       </w:r>
+      <w:r>
+        <w:t xml:space="preserve"> </w:t>
+      </w:r>
+      <w:r>
+        <w:t>Total insertion time of 50,000 elements was approximately 0.47 seconds</w:t>
+      </w:r>
+      <w:r>
+        <w:t xml:space="preserve"> (Figure 1)</w:t>
+      </w:r>
+      <w:r>
+        <w:t>, the second fastest.</w:t>
+      </w:r>
+      <w:r>
+        <w:t xml:space="preserve"> It’s interesting to note the large disparity between time taken inserting random data and prefix data (the slowest insertion out of any in the experiment). This implies that the increased cost of comparisons hurt this algorithm specifically much.</w:t>
+      </w:r>
     </w:p>
     <w:p/>
     <w:p>
@@ -546,7 +580,25 @@
     </w:p>
     <w:p>
       <w:r>
-        <w:t xml:space="preserve">The 2-3 tree consistently displayed the slowest search times of all three structures, across all conditions. At n = 50,000, the 2-3 tree’s search time on random data was roughly 3.1 microseconds, which compared to the LLRB and AVL tree’s roughly 1 microsecond search times, makes it three times slower. This, again, is very likely due to the specific implementation and per node overhead. Each node requires checking up to two keys, and Python list lookup carries more overhead than the standard scalar comparison used in binary tree structures. </w:t>
+        <w:t xml:space="preserve">The 2-3 tree consistently displayed the slowest search times of all three structures, across all conditions. At n = 50,000, the 2-3 tree’s search time on random data was roughly </w:t>
+      </w:r>
+      <w:r>
+        <w:t>5.4</w:t>
+      </w:r>
+      <w:r>
+        <w:t xml:space="preserve"> microseconds, which compared to the LLRB and AVL tree’s roughly </w:t>
+      </w:r>
+      <w:r>
+        <w:t>2.5</w:t>
+      </w:r>
+      <w:r>
+        <w:t xml:space="preserve"> microsecond search times, makes it</w:t>
+      </w:r>
+      <w:r>
+        <w:t xml:space="preserve"> twice as slow (Figure 2)</w:t>
+      </w:r>
+      <w:r>
+        <w:t xml:space="preserve">. This, again, is very likely due to the specific implementation and per node overhead. Each node requires checking up to two keys, and Python list lookup carries more overhead than the standard scalar comparison used in binary tree structures. </w:t>
       </w:r>
     </w:p>
     <w:p/>
@@ -570,7 +622,13 @@
         <w:t xml:space="preserve">Sorted inputs consistently </w:t>
       </w:r>
       <w:r>
-        <w:t>produced the worst-case performance for the 2-3 tree specifically, while the LLRB and AVL trees were not quite as affected. This is likely due to the fact that given sorted insertions, every inserted key will travel the same rightmost path down the tree, resulting in frequent splits as inserted keys consistently overflow 3-nodes on that path.</w:t>
+        <w:t xml:space="preserve">produced the worst-case performance for the 2-3 tree specifically, while the LLRB and AVL trees were not quite as affected. This is likely </w:t>
+      </w:r>
+      <w:r>
+        <w:t>since</w:t>
+      </w:r>
+      <w:r>
+        <w:t xml:space="preserve"> given sorted insertions, every inserted key will travel the same rightmost path down the tree, resulting in frequent splits as inserted keys consistently overflow 3-nodes on that path.</w:t>
       </w:r>
     </w:p>
     <w:p/>
@@ -613,11 +671,19 @@
     </w:p>
     <w:p>
       <w:r>
-        <w:t xml:space="preserve">The AVL tree is a self-balancing binary search tree that maintains a balance factor (the difference between left and right subtree heights) of at most 1 at every node. After each insertion, the tree checks the balance factor and performs rotations (left, right, left-right, or </w:t>
+        <w:t xml:space="preserve">The AVL tree is a self-balancing binary search tree that maintains a balance factor (the difference between left and right subtree heights) of at most 1 at every node. After each </w:t>
       </w:r>
       <w:r>
         <w:lastRenderedPageBreak/>
-        <w:t xml:space="preserve">right-left) to restore balance. This guarantees O(log n) worst-case time complexity for both insert and search operations. </w:t>
+        <w:t xml:space="preserve">insertion, the tree checks the balance factor and performs rotations (left, right, left-right, or right-left) to restore balance. This guarantees </w:t>
+      </w:r>
+      <w:proofErr w:type="gramStart"/>
+      <w:r>
+        <w:t>O(</w:t>
+      </w:r>
+      <w:proofErr w:type="gramEnd"/>
+      <w:r>
+        <w:t xml:space="preserve">log n) worst-case time complexity for both insert and search operations. </w:t>
       </w:r>
     </w:p>
     <w:p/>
@@ -638,13 +704,33 @@
     </w:p>
     <w:p>
       <w:r>
-        <w:t xml:space="preserve">For random data, the AVL tree’s total insertion time grew from approximately 0.002 s at 1,000 elements to 0.17 s at 50,000 elements. With sorted data, performance was similar, demonstrating that AVL’s rebalancing effectively prevents the degenerate linear behaviour that an unbalanced BST would exhibit. Prefix data produced </w:t>
-      </w:r>
-      <w:r>
-        <w:t xml:space="preserve">by far </w:t>
-      </w:r>
-      <w:r>
-        <w:t xml:space="preserve">the slowest insertion times, reaching approximately 0.23 s at 50,000 elements. This is because strings sharing a long common prefix require more character comparisons before a difference is found, increasing the cost of each comparison operation. The per-element insertion time remained relatively stable across dataset sizes, and the log-log plot shows approximately linear growth, consistent with the expected O(n log n) total insertion cost. </w:t>
+        <w:t>For random data, the AVL tree’s total insertion time grew from approximately 0.002 s at 1,000 elements to 0.</w:t>
+      </w:r>
+      <w:r>
+        <w:t>57</w:t>
+      </w:r>
+      <w:r>
+        <w:t xml:space="preserve"> s at 50,000 elements</w:t>
+      </w:r>
+      <w:r>
+        <w:t xml:space="preserve"> (Figure 1)</w:t>
+      </w:r>
+      <w:r>
+        <w:t xml:space="preserve">. </w:t>
+      </w:r>
+      <w:r>
+        <w:t xml:space="preserve">Interestingly, the other data types did not make insert performance worse at all, slightly better in fact. For sorted data, this demonstrates </w:t>
+      </w:r>
+      <w:r>
+        <w:t xml:space="preserve">that AVL’s rebalancing effectively prevents the degenerate linear behaviour that an unbalanced BST would exhibit. The per-element insertion time remained relatively stable across dataset sizes, and the log-log plot shows approximately linear growth, consistent with the expected </w:t>
+      </w:r>
+      <w:proofErr w:type="gramStart"/>
+      <w:r>
+        <w:t>O(</w:t>
+      </w:r>
+      <w:proofErr w:type="gramEnd"/>
+      <w:r>
+        <w:t xml:space="preserve">n log n) total insertion cost. </w:t>
       </w:r>
     </w:p>
     <w:p>
@@ -669,7 +755,33 @@
     </w:p>
     <w:p>
       <w:r>
-        <w:t xml:space="preserve">AVL search times were consistently lower than the 2-3 tree across all search types and data distributions, though slightly higher than LLRB in most cases. For random search queries on random data, AVL’s average search time grew from approximately 0.4 µs at 1,000 elements to 0.7 µs at 50,000 elements, confirming the expected O(log n) growth. Searching for elements known to be in the set produced similar times to random searches, while searching for elements not in the set was marginally faster since failed searches terminate at a null child without a final comparison. </w:t>
+        <w:t xml:space="preserve">AVL search times were consistently lower than the 2-3 tree across all search types and data distributions, though slightly higher than LLRB in </w:t>
+      </w:r>
+      <w:r>
+        <w:t>some</w:t>
+      </w:r>
+      <w:r>
+        <w:t xml:space="preserve"> cases. For random search queries on random data, AVL’s average search time grew from approximately 0.</w:t>
+      </w:r>
+      <w:r>
+        <w:t>8</w:t>
+      </w:r>
+      <w:r>
+        <w:t xml:space="preserve"> µs at 1,000 elements to </w:t>
+      </w:r>
+      <w:r>
+        <w:t>2.5</w:t>
+      </w:r>
+      <w:r>
+        <w:t xml:space="preserve"> µs at 50,000 elements, confirming the expected </w:t>
+      </w:r>
+      <w:proofErr w:type="gramStart"/>
+      <w:r>
+        <w:t>O(</w:t>
+      </w:r>
+      <w:proofErr w:type="gramEnd"/>
+      <w:r>
+        <w:t xml:space="preserve">log n) growth. Searching for elements known to be in the set produced similar times to random searches, while searching for elements not in the set was marginally faster since failed searches terminate at a null child without a final comparison. </w:t>
       </w:r>
     </w:p>
     <w:p/>
@@ -687,7 +799,28 @@
     </w:p>
     <w:p>
       <w:r>
-        <w:t>Duplicate insertions were correctly rejected (all returned False), with a total time of 0.00015 s for 100 duplicate attempts. Searching for the first inserted element (8.47 × 10−8 s) was faster than searching for the last inserted element (7.59 × 10−7 s), which reflects the different depths at which these elements sit in the balanced tree.</w:t>
+        <w:t>Duplicate insertions were correctly rejected (all returned False), with a total time of 0.00015 s for 100 duplicate attempts. Searching for the first inserted element (</w:t>
+      </w:r>
+      <w:r>
+        <w:t>3.08</w:t>
+      </w:r>
+      <w:r>
+        <w:t xml:space="preserve"> </w:t>
+      </w:r>
+      <w:r>
+        <w:t>×</w:t>
+      </w:r>
+      <w:r>
+        <w:t xml:space="preserve"> 10^-7</w:t>
+      </w:r>
+      <w:r>
+        <w:t xml:space="preserve"> s) was faster than searching for the last inserted element (</w:t>
+      </w:r>
+      <w:r>
+        <w:t>5.71</w:t>
+      </w:r>
+      <w:r>
+        <w:t xml:space="preserve"> × 10−7 s), which reflects the different depths at which these elements sit in the balanced tree.</w:t>
       </w:r>
     </w:p>
     <w:p/>
@@ -733,7 +866,23 @@
           <w:rFonts w:eastAsiaTheme="majorEastAsia" w:cstheme="minorHAnsi"/>
           <w:color w:val="000000" w:themeColor="text1"/>
         </w:rPr>
-        <w:t xml:space="preserve">. Each edge has a colour of either red or black, with the stipulation that all red edges go to the left. Its order is maintained through three operations: left rotation, right rotation, and colour flipping. With this, we can guarantee O(log n) worst case time complexity for both insert and search. </w:t>
+        <w:t xml:space="preserve">. Each edge has a colour of either red or black, with the stipulation that all red edges go to the left. Its order is maintained through three operations: left rotation, right rotation, and colour flipping. With this, we can guarantee </w:t>
+      </w:r>
+      <w:proofErr w:type="gramStart"/>
+      <w:r>
+        <w:rPr>
+          <w:rFonts w:eastAsiaTheme="majorEastAsia" w:cstheme="minorHAnsi"/>
+          <w:color w:val="000000" w:themeColor="text1"/>
+        </w:rPr>
+        <w:t>O(</w:t>
+      </w:r>
+      <w:proofErr w:type="gramEnd"/>
+      <w:r>
+        <w:rPr>
+          <w:rFonts w:eastAsiaTheme="majorEastAsia" w:cstheme="minorHAnsi"/>
+          <w:color w:val="000000" w:themeColor="text1"/>
+        </w:rPr>
+        <w:t xml:space="preserve">log n) worst case time complexity for both insert and search. </w:t>
       </w:r>
     </w:p>
     <w:p>
@@ -782,14 +931,72 @@
           <w:rFonts w:eastAsiaTheme="majorEastAsia" w:cstheme="minorHAnsi"/>
           <w:color w:val="000000" w:themeColor="text1"/>
         </w:rPr>
-        <w:t>LLRB followed the theoretical time complexity of O(n log n) for total insertion time, as can be seen in the log-log plot. It had an average insert time of around 0.36 seconds</w:t>
-      </w:r>
-      <w:r>
-        <w:rPr>
-          <w:rFonts w:eastAsiaTheme="majorEastAsia" w:cstheme="minorHAnsi"/>
-          <w:color w:val="000000" w:themeColor="text1"/>
-        </w:rPr>
-        <w:t xml:space="preserve"> for the tree of size 50000. It’s worth mentioning that the variance of LLRB insertion was the highest, likely since the order of the elements coming in can greatly determine the number of rotations and flips required to balance the tree,</w:t>
+        <w:t xml:space="preserve">LLRB followed the theoretical time complexity of </w:t>
+      </w:r>
+      <w:proofErr w:type="gramStart"/>
+      <w:r>
+        <w:rPr>
+          <w:rFonts w:eastAsiaTheme="majorEastAsia" w:cstheme="minorHAnsi"/>
+          <w:color w:val="000000" w:themeColor="text1"/>
+        </w:rPr>
+        <w:t>O(</w:t>
+      </w:r>
+      <w:proofErr w:type="gramEnd"/>
+      <w:r>
+        <w:rPr>
+          <w:rFonts w:eastAsiaTheme="majorEastAsia" w:cstheme="minorHAnsi"/>
+          <w:color w:val="000000" w:themeColor="text1"/>
+        </w:rPr>
+        <w:t>n log n) for total insertion time, as can be seen in the log-log plot. It had an average insert time of around 0.</w:t>
+      </w:r>
+      <w:r>
+        <w:rPr>
+          <w:rFonts w:eastAsiaTheme="majorEastAsia" w:cstheme="minorHAnsi"/>
+          <w:color w:val="000000" w:themeColor="text1"/>
+        </w:rPr>
+        <w:t>4</w:t>
+      </w:r>
+      <w:r>
+        <w:rPr>
+          <w:rFonts w:eastAsiaTheme="majorEastAsia" w:cstheme="minorHAnsi"/>
+          <w:color w:val="000000" w:themeColor="text1"/>
+        </w:rPr>
+        <w:t xml:space="preserve"> seconds</w:t>
+      </w:r>
+      <w:r>
+        <w:rPr>
+          <w:rFonts w:eastAsiaTheme="majorEastAsia" w:cstheme="minorHAnsi"/>
+          <w:color w:val="000000" w:themeColor="text1"/>
+        </w:rPr>
+        <w:t xml:space="preserve"> for the tree of size 50</w:t>
+      </w:r>
+      <w:r>
+        <w:rPr>
+          <w:rFonts w:eastAsiaTheme="majorEastAsia" w:cstheme="minorHAnsi"/>
+          <w:color w:val="000000" w:themeColor="text1"/>
+        </w:rPr>
+        <w:t>,</w:t>
+      </w:r>
+      <w:r>
+        <w:rPr>
+          <w:rFonts w:eastAsiaTheme="majorEastAsia" w:cstheme="minorHAnsi"/>
+          <w:color w:val="000000" w:themeColor="text1"/>
+        </w:rPr>
+        <w:t>000</w:t>
+      </w:r>
+      <w:r>
+        <w:rPr>
+          <w:rFonts w:eastAsiaTheme="majorEastAsia" w:cstheme="minorHAnsi"/>
+          <w:color w:val="000000" w:themeColor="text1"/>
+        </w:rPr>
+        <w:t xml:space="preserve"> (Figure 1)</w:t>
+      </w:r>
+      <w:r>
+        <w:rPr>
+          <w:rFonts w:eastAsiaTheme="majorEastAsia" w:cstheme="minorHAnsi"/>
+          <w:color w:val="000000" w:themeColor="text1"/>
+        </w:rPr>
+        <w:t>. It’s worth mentioning that the variance of LLRB insertion was the highest, likely since the order of the elements coming in can greatly determine the number of rotations and flips required to balance the tree,</w:t>
       </w:r>
     </w:p>
     <w:p>
@@ -836,7 +1043,21 @@
           <w:rFonts w:eastAsiaTheme="majorEastAsia" w:cstheme="minorHAnsi"/>
           <w:color w:val="000000" w:themeColor="text1"/>
         </w:rPr>
-        <w:t xml:space="preserve">Given random data on a tree of size 50000, the tree took on average 2.5 microseconds for a single element search. </w:t>
+        <w:t>Given random data on a tree of size 50000, the tree took on average 2.</w:t>
+      </w:r>
+      <w:r>
+        <w:rPr>
+          <w:rFonts w:eastAsiaTheme="majorEastAsia" w:cstheme="minorHAnsi"/>
+          <w:color w:val="000000" w:themeColor="text1"/>
+        </w:rPr>
+        <w:t>6</w:t>
+      </w:r>
+      <w:r>
+        <w:rPr>
+          <w:rFonts w:eastAsiaTheme="majorEastAsia" w:cstheme="minorHAnsi"/>
+          <w:color w:val="000000" w:themeColor="text1"/>
+        </w:rPr>
+        <w:t xml:space="preserve"> microseconds for a single element search. </w:t>
       </w:r>
       <w:r>
         <w:rPr>
@@ -898,7 +1119,77 @@
           <w:rFonts w:eastAsiaTheme="majorEastAsia" w:cstheme="minorHAnsi"/>
           <w:color w:val="000000" w:themeColor="text1"/>
         </w:rPr>
-        <w:t xml:space="preserve"> Searching for the first inserted element on average took four times less than searching for the last inserted element. Since the trees balance themselves, this shouldn’t necessarily be the case, and it is likely due to the specific number of iterations we are performing to test. Searching for an element that was just inserted in the tree was slightly faster (16%) than one not present in the tree. This is logical since searching for a missing element means going through the full depth. </w:t>
+        <w:t xml:space="preserve"> </w:t>
+      </w:r>
+      <w:r>
+        <w:rPr>
+          <w:rFonts w:eastAsiaTheme="majorEastAsia" w:cstheme="minorHAnsi"/>
+          <w:color w:val="000000" w:themeColor="text1"/>
+        </w:rPr>
+        <w:t>Like the AVL, s</w:t>
+      </w:r>
+      <w:r>
+        <w:rPr>
+          <w:rFonts w:eastAsiaTheme="majorEastAsia" w:cstheme="minorHAnsi"/>
+          <w:color w:val="000000" w:themeColor="text1"/>
+        </w:rPr>
+        <w:t>earching for the first inserted element on average took</w:t>
+      </w:r>
+      <w:r>
+        <w:rPr>
+          <w:rFonts w:eastAsiaTheme="majorEastAsia" w:cstheme="minorHAnsi"/>
+          <w:color w:val="000000" w:themeColor="text1"/>
+        </w:rPr>
+        <w:t xml:space="preserve"> around half the time</w:t>
+      </w:r>
+      <w:r>
+        <w:rPr>
+          <w:rFonts w:eastAsiaTheme="majorEastAsia" w:cstheme="minorHAnsi"/>
+          <w:color w:val="000000" w:themeColor="text1"/>
+        </w:rPr>
+        <w:t xml:space="preserve"> </w:t>
+      </w:r>
+      <w:r>
+        <w:rPr>
+          <w:rFonts w:eastAsiaTheme="majorEastAsia" w:cstheme="minorHAnsi"/>
+          <w:color w:val="000000" w:themeColor="text1"/>
+        </w:rPr>
+        <w:t>of</w:t>
+      </w:r>
+      <w:r>
+        <w:rPr>
+          <w:rFonts w:eastAsiaTheme="majorEastAsia" w:cstheme="minorHAnsi"/>
+          <w:color w:val="000000" w:themeColor="text1"/>
+        </w:rPr>
+        <w:t xml:space="preserve"> searching for the last inserted element. </w:t>
+      </w:r>
+      <w:r>
+        <w:rPr>
+          <w:rFonts w:eastAsiaTheme="majorEastAsia" w:cstheme="minorHAnsi"/>
+          <w:color w:val="000000" w:themeColor="text1"/>
+        </w:rPr>
+        <w:t xml:space="preserve">Although </w:t>
+      </w:r>
+      <w:r>
+        <w:rPr>
+          <w:rFonts w:eastAsiaTheme="majorEastAsia" w:cstheme="minorHAnsi"/>
+          <w:color w:val="000000" w:themeColor="text1"/>
+        </w:rPr>
+        <w:t xml:space="preserve">the trees balance themselves, </w:t>
+      </w:r>
+      <w:r>
+        <w:rPr>
+          <w:rFonts w:eastAsiaTheme="majorEastAsia" w:cstheme="minorHAnsi"/>
+          <w:color w:val="000000" w:themeColor="text1"/>
+        </w:rPr>
+        <w:t>these elements will sit at different depths. However, we should note this largely depends on the number of total insertions</w:t>
+      </w:r>
+      <w:r>
+        <w:rPr>
+          <w:rFonts w:eastAsiaTheme="majorEastAsia" w:cstheme="minorHAnsi"/>
+          <w:color w:val="000000" w:themeColor="text1"/>
+        </w:rPr>
+        <w:t xml:space="preserve">. </w:t>
       </w:r>
     </w:p>
     <w:p/>
@@ -939,7 +1230,21 @@
         <w:rPr>
           <w:rFonts w:cstheme="minorHAnsi"/>
         </w:rPr>
-        <w:t xml:space="preserve">All three structures share an O(log n) worst-case time complexity for both search and insertion, and O(n) space complexity. Despite this theoretical equivalence, however, some practical features in implementation and the experimental results demonstrate significant differences in performance, and trade-offs with each structure. </w:t>
+        <w:t xml:space="preserve">All three structures share an </w:t>
+      </w:r>
+      <w:proofErr w:type="gramStart"/>
+      <w:r>
+        <w:rPr>
+          <w:rFonts w:cstheme="minorHAnsi"/>
+        </w:rPr>
+        <w:t>O(</w:t>
+      </w:r>
+      <w:proofErr w:type="gramEnd"/>
+      <w:r>
+        <w:rPr>
+          <w:rFonts w:cstheme="minorHAnsi"/>
+        </w:rPr>
+        <w:t xml:space="preserve">log n) worst-case time complexity for both search and insertion, and O(n) space complexity. Despite this theoretical equivalence, however, some practical features in implementation and the experimental results demonstrate significant differences in performance, and trade-offs with each structure. </w:t>
       </w:r>
     </w:p>
     <w:p>
@@ -1004,7 +1309,21 @@
         <w:rPr>
           <w:rFonts w:cstheme="minorHAnsi"/>
         </w:rPr>
-        <w:t xml:space="preserve"> consistently with O(n log n) total insertion time. The most notable difference was found under sorted input, where the 2-3 tree showed higher insertion times than both LLRB and AVL. This </w:t>
+        <w:t xml:space="preserve"> consistently with </w:t>
+      </w:r>
+      <w:proofErr w:type="gramStart"/>
+      <w:r>
+        <w:rPr>
+          <w:rFonts w:cstheme="minorHAnsi"/>
+        </w:rPr>
+        <w:t>O(</w:t>
+      </w:r>
+      <w:proofErr w:type="gramEnd"/>
+      <w:r>
+        <w:rPr>
+          <w:rFonts w:cstheme="minorHAnsi"/>
+        </w:rPr>
+        <w:t xml:space="preserve">n log n) total insertion time. The most notable difference was found under sorted input, where the 2-3 tree showed higher insertion times than both LLRB and AVL. This </w:t>
       </w:r>
       <w:r>
         <w:rPr>
@@ -1122,34 +1441,106 @@
         <w:rPr>
           <w:rFonts w:cstheme="minorHAnsi"/>
         </w:rPr>
-        <w:t>Based on the results, AVL trees appear to be the most suitable choice when consistent performance across all conditions is the priority. Its height balancing ensures the most predictable search and insertion times regardless of input order, which is represented in the edge case data.</w:t>
-      </w:r>
-    </w:p>
-    <w:p>
-      <w:pPr>
-        <w:rPr>
-          <w:rFonts w:cstheme="minorHAnsi"/>
-        </w:rPr>
-      </w:pPr>
-    </w:p>
-    <w:p>
-      <w:pPr>
-        <w:rPr>
-          <w:rFonts w:cstheme="minorHAnsi"/>
-        </w:rPr>
-      </w:pPr>
+        <w:t xml:space="preserve">Based on the results, </w:t>
+      </w:r>
+      <w:r>
+        <w:rPr>
+          <w:rFonts w:cstheme="minorHAnsi"/>
+        </w:rPr>
+        <w:t xml:space="preserve">either </w:t>
+      </w:r>
+      <w:r>
+        <w:rPr>
+          <w:rFonts w:cstheme="minorHAnsi"/>
+        </w:rPr>
+        <w:t xml:space="preserve">AVL trees </w:t>
+      </w:r>
+      <w:r>
+        <w:rPr>
+          <w:rFonts w:cstheme="minorHAnsi"/>
+        </w:rPr>
+        <w:t xml:space="preserve">or LLRB </w:t>
+      </w:r>
+      <w:r>
+        <w:rPr>
+          <w:rFonts w:cstheme="minorHAnsi"/>
+        </w:rPr>
+        <w:t>appear to be the most suitable choice when consistent performance across all conditions is the priority.</w:t>
+      </w:r>
+      <w:r>
+        <w:rPr>
+          <w:rFonts w:cstheme="minorHAnsi"/>
+        </w:rPr>
+        <w:t xml:space="preserve"> AVL’s</w:t>
+      </w:r>
+      <w:r>
+        <w:rPr>
+          <w:rFonts w:cstheme="minorHAnsi"/>
+        </w:rPr>
+        <w:t xml:space="preserve"> height balancing ensures the most predictable search times regardless of input order, which is represented in the edge case data.</w:t>
+      </w:r>
+    </w:p>
+    <w:p>
+      <w:pPr>
+        <w:rPr>
+          <w:rFonts w:cstheme="minorHAnsi"/>
+        </w:rPr>
+      </w:pPr>
+    </w:p>
+    <w:p>
+      <w:pPr>
+        <w:rPr>
+          <w:rFonts w:cstheme="minorHAnsi"/>
+        </w:rPr>
+      </w:pPr>
+      <w:r>
+        <w:rPr>
+          <w:rFonts w:cstheme="minorHAnsi"/>
+        </w:rPr>
+        <w:t xml:space="preserve">LLRB trees were very often able to achieve faster results than </w:t>
+      </w:r>
+      <w:r>
+        <w:rPr>
+          <w:rFonts w:cstheme="minorHAnsi"/>
+        </w:rPr>
+        <w:t>AVL and have a consistently faster insert time. H</w:t>
+      </w:r>
+      <w:r>
+        <w:rPr>
+          <w:rFonts w:cstheme="minorHAnsi"/>
+        </w:rPr>
+        <w:t>owever</w:t>
+      </w:r>
+      <w:r>
+        <w:rPr>
+          <w:rFonts w:cstheme="minorHAnsi"/>
+        </w:rPr>
+        <w:t>, they</w:t>
+      </w:r>
+      <w:r>
+        <w:rPr>
+          <w:rFonts w:cstheme="minorHAnsi"/>
+        </w:rPr>
+        <w:t xml:space="preserve"> displayed notable deviations at low to mid data set sizes. While this is likely implementation specific, that would suggest that LLRB trees, while </w:t>
+      </w:r>
+      <w:r>
+        <w:rPr>
+          <w:rFonts w:cstheme="minorHAnsi"/>
+        </w:rPr>
+        <w:t xml:space="preserve">faster </w:t>
+      </w:r>
       <w:r>
         <w:rPr>
           <w:rFonts w:cstheme="minorHAnsi"/>
         </w:rPr>
         <w:lastRenderedPageBreak/>
-        <w:t xml:space="preserve">LLRB trees were very often able to achieve faster results than AVL, however displayed notable deviations at low to mid data set sizes. While this is likely implementation specific, that would suggest that LLRB trees, while </w:t>
-      </w:r>
-      <w:r>
-        <w:rPr>
-          <w:rFonts w:cstheme="minorHAnsi"/>
-        </w:rPr>
-        <w:t>faster in the best case, risk inconsistency.</w:t>
+        <w:t>in the best case, risk inconsistency.</w:t>
+      </w:r>
+      <w:r>
+        <w:rPr>
+          <w:rFonts w:cstheme="minorHAnsi"/>
+        </w:rPr>
+        <w:t xml:space="preserve"> Thus, the choice between the two is up to the user, based on which of these upsides they value more.</w:t>
       </w:r>
     </w:p>
     <w:p>
@@ -1401,7 +1792,23 @@
                 <w:rFonts w:ascii="Arial" w:hAnsi="Arial" w:cs="Arial"/>
                 <w:color w:val="000000" w:themeColor="text1"/>
               </w:rPr>
-              <w:t>LLRB implementation and report, ExperimentalFramework code</w:t>
+              <w:t xml:space="preserve">LLRB implementation and report, </w:t>
+            </w:r>
+            <w:proofErr w:type="spellStart"/>
+            <w:r>
+              <w:rPr>
+                <w:rFonts w:ascii="Arial" w:hAnsi="Arial" w:cs="Arial"/>
+                <w:color w:val="000000" w:themeColor="text1"/>
+              </w:rPr>
+              <w:t>ExperimentalFramework</w:t>
+            </w:r>
+            <w:proofErr w:type="spellEnd"/>
+            <w:r>
+              <w:rPr>
+                <w:rFonts w:ascii="Arial" w:hAnsi="Arial" w:cs="Arial"/>
+                <w:color w:val="000000" w:themeColor="text1"/>
+              </w:rPr>
+              <w:t xml:space="preserve"> code</w:t>
             </w:r>
           </w:p>
         </w:tc>
@@ -1730,6 +2137,7 @@
               </w:rPr>
               <w:t xml:space="preserve"> </w:t>
             </w:r>
+            <w:proofErr w:type="spellStart"/>
             <w:r>
               <w:rPr>
                 <w:rFonts w:ascii="Arial" w:hAnsi="Arial" w:cs="Arial" w:hint="eastAsia"/>
@@ -1738,6 +2146,7 @@
               </w:rPr>
               <w:t>Yajun</w:t>
             </w:r>
+            <w:proofErr w:type="spellEnd"/>
             <w:r>
               <w:rPr>
                 <w:rFonts w:ascii="Arial" w:hAnsi="Arial" w:cs="Arial"/>
@@ -1783,6 +2192,9 @@
             </w:r>
             <w:r>
               <w:t>code and report</w:t>
+            </w:r>
+            <w:r>
+              <w:t>, section 1 of report</w:t>
             </w:r>
           </w:p>
           <w:p>
@@ -1826,25 +2238,6 @@
         </w:tc>
       </w:tr>
     </w:tbl>
-    <w:p>
-      <w:pPr>
-        <w:rPr>
-          <w:rFonts w:ascii="Arial" w:hAnsi="Arial" w:cs="Arial"/>
-          <w:i/>
-          <w:iCs/>
-          <w:color w:val="BFBFBF" w:themeColor="background1" w:themeShade="BF"/>
-        </w:rPr>
-      </w:pPr>
-      <w:r>
-        <w:rPr>
-          <w:rFonts w:ascii="Arial" w:hAnsi="Arial" w:cs="Arial"/>
-          <w:i/>
-          <w:iCs/>
-          <w:color w:val="BFBFBF" w:themeColor="background1" w:themeShade="BF"/>
-        </w:rPr>
-        <w:t>(Section 4 should be no more than half a page)</w:t>
-      </w:r>
-    </w:p>
     <w:p>
       <w:pPr>
         <w:rPr>
@@ -3040,6 +3433,7 @@
   <w:style w:type="character" w:default="1" w:styleId="DefaultParagraphFont">
     <w:name w:val="Default Paragraph Font"/>
     <w:uiPriority w:val="1"/>
+    <w:semiHidden/>
     <w:unhideWhenUsed/>
   </w:style>
   <w:style w:type="table" w:default="1" w:styleId="TableNormal">

</xml_diff>